<commit_message>
docs: fix wrapper names and a reference found in the mas audit
RAM V2.4: two blocks, two wrappers, per Naming Rule V1.1 rule 2.1:
m_qnsc_wrap_isram and m_qnsc_wrap_dsram, in design/isram and design/dsram
(was one m_qnsc_wrap_axi4_sram in a design/ram that does not exist).
TIMER V2.5: wrapper m_qnsc_wrap_timer; apb_timer_unit is the module of
pulp-platform/timer_unit. ROM V3.1: bootloader debugging is SYSDBG 7.2.
Template and TIMER cite Naming Rule V1.1. design/scrc README: the SYSCSR
generated module is m_qnsc_syscsr_csr, as the SYSCSR MAS says.
</commit_message>
<xml_diff>
--- a/doc/specs/docx/QNSC_RAM_MAS.docx
+++ b/doc/specs/docx/QNSC_RAM_MAS.docx
@@ -15,7 +15,7 @@
         <w:pStyle w:val="Subtitle"/>
       </w:pPr>
       <w:r>
-        <w:t xml:space="preserve">MICRO-ARCHITECTURE SPECIFICATION – V2.3</w:t>
+        <w:t xml:space="preserve">MICRO-ARCHITECTURE SPECIFICATION – V2.4</w:t>
       </w:r>
     </w:p>
     <w:p>
@@ -103,7 +103,7 @@
             <w:jc w:val="left"/>
           </w:pPr>
           <w:r>
-            <w:t xml:space="preserve">Table 5-2. RAM parameters</w:t>
+            <w:t xml:space="preserve">Table 5-2. IP parameters, fixed inside each wrapper</w:t>
           </w:r>
         </w:p>
         <w:p>
@@ -143,7 +143,7 @@
             <w:jc w:val="left"/>
           </w:pPr>
           <w:r>
-            <w:t xml:space="preserve">Table 8-1. The two instances</w:t>
+            <w:t xml:space="preserve">Table 8-1. The two blocks</w:t>
           </w:r>
         </w:p>
         <w:p>
@@ -693,6 +693,152 @@
           </w:p>
         </w:tc>
       </w:tr>
+      <w:tr>
+        <w:tc>
+          <w:tcPr/>
+          <w:p>
+            <w:pPr>
+              <w:pStyle w:val="Compact"/>
+              <w:jc w:val="left"/>
+            </w:pPr>
+            <w:r>
+              <w:t xml:space="preserve">V2.4</w:t>
+            </w:r>
+          </w:p>
+        </w:tc>
+        <w:tc>
+          <w:tcPr/>
+          <w:p>
+            <w:pPr>
+              <w:pStyle w:val="Compact"/>
+              <w:jc w:val="left"/>
+            </w:pPr>
+            <w:r>
+              <w:t xml:space="preserve">2026-09-28</w:t>
+            </w:r>
+          </w:p>
+        </w:tc>
+        <w:tc>
+          <w:tcPr/>
+          <w:p>
+            <w:pPr>
+              <w:pStyle w:val="Compact"/>
+              <w:jc w:val="left"/>
+            </w:pPr>
+            <w:r>
+              <w:t xml:space="preserve">Nghia VT</w:t>
+            </w:r>
+          </w:p>
+        </w:tc>
+        <w:tc>
+          <w:tcPr/>
+          <w:p>
+            <w:pPr>
+              <w:pStyle w:val="Compact"/>
+              <w:jc w:val="left"/>
+            </w:pPr>
+            <w:r>
+              <w:t xml:space="preserve">–</w:t>
+            </w:r>
+          </w:p>
+        </w:tc>
+        <w:tc>
+          <w:tcPr/>
+          <w:p>
+            <w:pPr>
+              <w:pStyle w:val="Compact"/>
+              <w:jc w:val="left"/>
+            </w:pPr>
+            <w:r>
+              <w:t xml:space="preserve">Two blocks, two wrappers, per Naming Rule V1.1 rule 2.1:</w:t>
+            </w:r>
+            <w:r>
+              <w:t xml:space="preserve"> </w:t>
+            </w:r>
+            <w:r>
+              <w:rPr>
+                <w:rStyle w:val="VerbatimChar"/>
+              </w:rPr>
+              <w:t xml:space="preserve">m_qnsc_wrap_isram</w:t>
+            </w:r>
+            <w:r>
+              <w:t xml:space="preserve"> </w:t>
+            </w:r>
+            <w:r>
+              <w:t xml:space="preserve">in</w:t>
+            </w:r>
+            <w:r>
+              <w:t xml:space="preserve"> </w:t>
+            </w:r>
+            <w:r>
+              <w:rPr>
+                <w:rStyle w:val="VerbatimChar"/>
+              </w:rPr>
+              <w:t xml:space="preserve">design/isram</w:t>
+            </w:r>
+            <w:r>
+              <w:t xml:space="preserve">,</w:t>
+            </w:r>
+            <w:r>
+              <w:t xml:space="preserve"> </w:t>
+            </w:r>
+            <w:r>
+              <w:rPr>
+                <w:rStyle w:val="VerbatimChar"/>
+              </w:rPr>
+              <w:t xml:space="preserve">m_qnsc_wrap_dsram</w:t>
+            </w:r>
+            <w:r>
+              <w:t xml:space="preserve"> </w:t>
+            </w:r>
+            <w:r>
+              <w:t xml:space="preserve">in</w:t>
+            </w:r>
+            <w:r>
+              <w:t xml:space="preserve"> </w:t>
+            </w:r>
+            <w:r>
+              <w:rPr>
+                <w:rStyle w:val="VerbatimChar"/>
+              </w:rPr>
+              <w:t xml:space="preserve">design/dsram</w:t>
+            </w:r>
+            <w:r>
+              <w:t xml:space="preserve"> </w:t>
+            </w:r>
+            <w:r>
+              <w:t xml:space="preserve">(was one</w:t>
+            </w:r>
+            <w:r>
+              <w:t xml:space="preserve"> </w:t>
+            </w:r>
+            <w:r>
+              <w:rPr>
+                <w:rStyle w:val="VerbatimChar"/>
+              </w:rPr>
+              <w:t xml:space="preserve">m_qnsc_wrap_axi4_sram</w:t>
+            </w:r>
+            <w:r>
+              <w:t xml:space="preserve"> </w:t>
+            </w:r>
+            <w:r>
+              <w:t xml:space="preserve">in</w:t>
+            </w:r>
+            <w:r>
+              <w:t xml:space="preserve"> </w:t>
+            </w:r>
+            <w:r>
+              <w:rPr>
+                <w:rStyle w:val="VerbatimChar"/>
+              </w:rPr>
+              <w:t xml:space="preserve">design/ram</w:t>
+            </w:r>
+            <w:r>
+              <w:t xml:space="preserve">). No change in behaviour</w:t>
+            </w:r>
+          </w:p>
+        </w:tc>
+      </w:tr>
     </w:tbl>
     <w:bookmarkEnd w:id="26"/>
     <w:bookmarkStart w:id="27" w:name="overview"/>
@@ -733,7 +879,7 @@
         <w:t xml:space="preserve"> </w:t>
       </w:r>
       <w:r>
-        <w:t xml:space="preserve">are the on-chip RAMs of QSOC. Each is one instance of</w:t>
+        <w:t xml:space="preserve">are the on-chip RAMs of QSOC. They are two blocks with one design:</w:t>
       </w:r>
       <w:r>
         <w:t xml:space="preserve"> </w:t>
@@ -742,10 +888,25 @@
         <w:rPr>
           <w:rStyle w:val="VerbatimChar"/>
         </w:rPr>
-        <w:t xml:space="preserve">m_qnsc_wrap_axi4_sram</w:t>
-      </w:r>
-      <w:r>
-        <w:t xml:space="preserve">: the upstream</w:t>
+        <w:t xml:space="preserve">m_qnsc_wrap_isram</w:t>
+      </w:r>
+      <w:r>
+        <w:t xml:space="preserve"> </w:t>
+      </w:r>
+      <w:r>
+        <w:t xml:space="preserve">and</w:t>
+      </w:r>
+      <w:r>
+        <w:t xml:space="preserve"> </w:t>
+      </w:r>
+      <w:r>
+        <w:rPr>
+          <w:rStyle w:val="VerbatimChar"/>
+        </w:rPr>
+        <w:t xml:space="preserve">m_qnsc_wrap_dsram</w:t>
+      </w:r>
+      <w:r>
+        <w:t xml:space="preserve">, each the upstream</w:t>
       </w:r>
       <w:r>
         <w:t xml:space="preserve"> </w:t>
@@ -757,13 +918,13 @@
         <w:t xml:space="preserve">AXI4-SRAM-CONTROLLER</w:t>
       </w:r>
       <w:r>
-        <w:t xml:space="preserve">, unmodified, plus a</w:t>
-      </w:r>
-      <w:r>
-        <w:t xml:space="preserve"> </w:t>
-      </w:r>
-      <w:r>
-        <w:t xml:space="preserve">write-strobe FIFO, in front of an SMIC 28 nm single-port SRAM macro. The block does</w:t>
+        <w:t xml:space="preserve">,</w:t>
+      </w:r>
+      <w:r>
+        <w:t xml:space="preserve"> </w:t>
+      </w:r>
+      <w:r>
+        <w:t xml:space="preserve">unmodified, plus a write-strobe FIFO, in front of an SMIC 28 nm single-port SRAM macro. The block does</w:t>
       </w:r>
       <w:r>
         <w:t xml:space="preserve"> </w:t>
@@ -1151,7 +1312,7 @@
         <w:pStyle w:val="BodyText"/>
       </w:pPr>
       <w:r>
-        <w:t xml:space="preserve">File</w:t>
+        <w:t xml:space="preserve">Files</w:t>
       </w:r>
       <w:r>
         <w:t xml:space="preserve"> </w:t>
@@ -1160,10 +1321,31 @@
         <w:rPr>
           <w:rStyle w:val="VerbatimChar"/>
         </w:rPr>
-        <w:t xml:space="preserve">design/ram/rtl/m_qnsc_wrap_axi4_sram.sv</w:t>
-      </w:r>
-      <w:r>
-        <w:t xml:space="preserve">, owner Nghia Van Trong.</w:t>
+        <w:t xml:space="preserve">design/isram/rtl/m_qnsc_wrap_isram.sv</w:t>
+      </w:r>
+      <w:r>
+        <w:t xml:space="preserve"> </w:t>
+      </w:r>
+      <w:r>
+        <w:t xml:space="preserve">and</w:t>
+      </w:r>
+      <w:r>
+        <w:t xml:space="preserve"> </w:t>
+      </w:r>
+      <w:r>
+        <w:rPr>
+          <w:rStyle w:val="VerbatimChar"/>
+        </w:rPr>
+        <w:t xml:space="preserve">design/dsram/rtl/m_qnsc_wrap_dsram.sv</w:t>
+      </w:r>
+      <w:r>
+        <w:t xml:space="preserve">,</w:t>
+      </w:r>
+      <w:r>
+        <w:t xml:space="preserve"> </w:t>
+      </w:r>
+      <w:r>
+        <w:t xml:space="preserve">owner Nghia Van Trong.</w:t>
       </w:r>
     </w:p>
     <w:bookmarkEnd w:id="27"/>
@@ -1457,7 +1639,7 @@
               <a:graphicData uri="http://schemas.openxmlformats.org/drawingml/2006/picture">
                 <pic:pic>
                   <pic:nvPicPr>
-                    <pic:cNvPr descr="../img/fig_ram_simple.png" id="31" name="Picture"/>
+                    <pic:cNvPr descr="../figures/img/fig_ram_simple.png" id="31" name="Picture"/>
                     <pic:cNvPicPr>
                       <a:picLocks noChangeArrowheads="1" noChangeAspect="1"/>
                     </pic:cNvPicPr>
@@ -3601,7 +3783,7 @@
         <w:pStyle w:val="Tablecaption0"/>
       </w:pPr>
       <w:r>
-        <w:t xml:space="preserve">Table 5-2. RAM parameters</w:t>
+        <w:t xml:space="preserve">Table 5-2. IP parameters, fixed inside each wrapper</w:t>
       </w:r>
     </w:p>
     <w:tbl>
@@ -3610,7 +3792,7 @@
         <w:tblW w:type="pct" w:w="5000"/>
         <w:tblLayout w:type="fixed"/>
         <w:tblLook w:firstRow="1" w:lastRow="0" w:firstColumn="0" w:lastColumn="0" w:noHBand="0" w:noVBand="0" w:val="0020"/>
-        <w:tblCaption w:val="RAM parameters"/>
+        <w:tblCaption w:val="IP parameters, fixed inside each wrapper"/>
       </w:tblPr>
       <w:tblGrid>
         <w:gridCol w:w="1697"/>
@@ -6012,7 +6194,7 @@
         <w:pStyle w:val="Tablecaption0"/>
       </w:pPr>
       <w:r>
-        <w:t xml:space="preserve">Table 8-1. The two instances</w:t>
+        <w:t xml:space="preserve">Table 8-1. The two blocks</w:t>
       </w:r>
     </w:p>
     <w:tbl>
@@ -6020,7 +6202,7 @@
         <w:tblStyle w:val="TableGrid"/>
         <w:tblW w:type="auto" w:w="0"/>
         <w:tblLook w:firstRow="1" w:lastRow="0" w:firstColumn="0" w:lastColumn="0" w:noHBand="0" w:noVBand="0" w:val="0020"/>
-        <w:tblCaption w:val="The two instances"/>
+        <w:tblCaption w:val="The two blocks"/>
       </w:tblPr>
       <w:tblGrid>
         <w:gridCol w:w="1980"/>
@@ -6040,7 +6222,7 @@
               <w:jc w:val="left"/>
             </w:pPr>
             <w:r>
-              <w:t xml:space="preserve">Instance</w:t>
+              <w:t xml:space="preserve">Block</w:t>
             </w:r>
           </w:p>
         </w:tc>
@@ -6211,7 +6393,7 @@
         <w:pStyle w:val="BodyText"/>
       </w:pPr>
       <w:r>
-        <w:t xml:space="preserve">The instances differ only in</w:t>
+        <w:t xml:space="preserve">The two wrappers differ only in</w:t>
       </w:r>
       <w:r>
         <w:t xml:space="preserve"> </w:t>
@@ -6221,6 +6403,24 @@
           <w:rStyle w:val="VerbatimChar"/>
         </w:rPr>
         <w:t xml:space="preserve">PARA_SRAM_DEPTH</w:t>
+      </w:r>
+      <w:r>
+        <w:t xml:space="preserve">; neither has a parameter. One of</w:t>
+      </w:r>
+      <w:r>
+        <w:t xml:space="preserve"> </w:t>
+      </w:r>
+      <w:r>
+        <w:t xml:space="preserve">each in</w:t>
+      </w:r>
+      <w:r>
+        <w:t xml:space="preserve"> </w:t>
+      </w:r>
+      <w:r>
+        <w:rPr>
+          <w:rStyle w:val="VerbatimChar"/>
+        </w:rPr>
+        <w:t xml:space="preserve">design/top</w:t>
       </w:r>
       <w:r>
         <w:t xml:space="preserve">. Each decode window (section 1) equals its macro</w:t>
@@ -8848,7 +9048,7 @@
       <w:rPr>
         <w:szCs w:val="26"/>
       </w:rPr>
-      <w:t>V2.3</w:t>
+      <w:t>V2.4</w:t>
     </w:r>
     <w:r>
       <w:rPr>

</xml_diff>

<commit_message>
docs: fix wrapper names and a reference found in the mas audit (#44)
RAM V2.4: two blocks, two wrappers, per Naming Rule V1.1 rule 2.1:
m_qnsc_wrap_isram and m_qnsc_wrap_dsram, in design/isram and design/dsram
(was one m_qnsc_wrap_axi4_sram in a design/ram that does not exist).
TIMER V2.5: wrapper m_qnsc_wrap_timer; apb_timer_unit is the module of
pulp-platform/timer_unit. ROM V3.1: bootloader debugging is SYSDBG 7.2.
Template and TIMER cite Naming Rule V1.1. design/scrc README: the SYSCSR
generated module is m_qnsc_syscsr_csr, as the SYSCSR MAS says.
</commit_message>
<xml_diff>
--- a/doc/specs/docx/QNSC_RAM_MAS.docx
+++ b/doc/specs/docx/QNSC_RAM_MAS.docx
@@ -15,7 +15,7 @@
         <w:pStyle w:val="Subtitle"/>
       </w:pPr>
       <w:r>
-        <w:t xml:space="preserve">MICRO-ARCHITECTURE SPECIFICATION – V2.3</w:t>
+        <w:t xml:space="preserve">MICRO-ARCHITECTURE SPECIFICATION – V2.4</w:t>
       </w:r>
     </w:p>
     <w:p>
@@ -103,7 +103,7 @@
             <w:jc w:val="left"/>
           </w:pPr>
           <w:r>
-            <w:t xml:space="preserve">Table 5-2. RAM parameters</w:t>
+            <w:t xml:space="preserve">Table 5-2. IP parameters, fixed inside each wrapper</w:t>
           </w:r>
         </w:p>
         <w:p>
@@ -143,7 +143,7 @@
             <w:jc w:val="left"/>
           </w:pPr>
           <w:r>
-            <w:t xml:space="preserve">Table 8-1. The two instances</w:t>
+            <w:t xml:space="preserve">Table 8-1. The two blocks</w:t>
           </w:r>
         </w:p>
         <w:p>
@@ -693,6 +693,152 @@
           </w:p>
         </w:tc>
       </w:tr>
+      <w:tr>
+        <w:tc>
+          <w:tcPr/>
+          <w:p>
+            <w:pPr>
+              <w:pStyle w:val="Compact"/>
+              <w:jc w:val="left"/>
+            </w:pPr>
+            <w:r>
+              <w:t xml:space="preserve">V2.4</w:t>
+            </w:r>
+          </w:p>
+        </w:tc>
+        <w:tc>
+          <w:tcPr/>
+          <w:p>
+            <w:pPr>
+              <w:pStyle w:val="Compact"/>
+              <w:jc w:val="left"/>
+            </w:pPr>
+            <w:r>
+              <w:t xml:space="preserve">2026-09-28</w:t>
+            </w:r>
+          </w:p>
+        </w:tc>
+        <w:tc>
+          <w:tcPr/>
+          <w:p>
+            <w:pPr>
+              <w:pStyle w:val="Compact"/>
+              <w:jc w:val="left"/>
+            </w:pPr>
+            <w:r>
+              <w:t xml:space="preserve">Nghia VT</w:t>
+            </w:r>
+          </w:p>
+        </w:tc>
+        <w:tc>
+          <w:tcPr/>
+          <w:p>
+            <w:pPr>
+              <w:pStyle w:val="Compact"/>
+              <w:jc w:val="left"/>
+            </w:pPr>
+            <w:r>
+              <w:t xml:space="preserve">–</w:t>
+            </w:r>
+          </w:p>
+        </w:tc>
+        <w:tc>
+          <w:tcPr/>
+          <w:p>
+            <w:pPr>
+              <w:pStyle w:val="Compact"/>
+              <w:jc w:val="left"/>
+            </w:pPr>
+            <w:r>
+              <w:t xml:space="preserve">Two blocks, two wrappers, per Naming Rule V1.1 rule 2.1:</w:t>
+            </w:r>
+            <w:r>
+              <w:t xml:space="preserve"> </w:t>
+            </w:r>
+            <w:r>
+              <w:rPr>
+                <w:rStyle w:val="VerbatimChar"/>
+              </w:rPr>
+              <w:t xml:space="preserve">m_qnsc_wrap_isram</w:t>
+            </w:r>
+            <w:r>
+              <w:t xml:space="preserve"> </w:t>
+            </w:r>
+            <w:r>
+              <w:t xml:space="preserve">in</w:t>
+            </w:r>
+            <w:r>
+              <w:t xml:space="preserve"> </w:t>
+            </w:r>
+            <w:r>
+              <w:rPr>
+                <w:rStyle w:val="VerbatimChar"/>
+              </w:rPr>
+              <w:t xml:space="preserve">design/isram</w:t>
+            </w:r>
+            <w:r>
+              <w:t xml:space="preserve">,</w:t>
+            </w:r>
+            <w:r>
+              <w:t xml:space="preserve"> </w:t>
+            </w:r>
+            <w:r>
+              <w:rPr>
+                <w:rStyle w:val="VerbatimChar"/>
+              </w:rPr>
+              <w:t xml:space="preserve">m_qnsc_wrap_dsram</w:t>
+            </w:r>
+            <w:r>
+              <w:t xml:space="preserve"> </w:t>
+            </w:r>
+            <w:r>
+              <w:t xml:space="preserve">in</w:t>
+            </w:r>
+            <w:r>
+              <w:t xml:space="preserve"> </w:t>
+            </w:r>
+            <w:r>
+              <w:rPr>
+                <w:rStyle w:val="VerbatimChar"/>
+              </w:rPr>
+              <w:t xml:space="preserve">design/dsram</w:t>
+            </w:r>
+            <w:r>
+              <w:t xml:space="preserve"> </w:t>
+            </w:r>
+            <w:r>
+              <w:t xml:space="preserve">(was one</w:t>
+            </w:r>
+            <w:r>
+              <w:t xml:space="preserve"> </w:t>
+            </w:r>
+            <w:r>
+              <w:rPr>
+                <w:rStyle w:val="VerbatimChar"/>
+              </w:rPr>
+              <w:t xml:space="preserve">m_qnsc_wrap_axi4_sram</w:t>
+            </w:r>
+            <w:r>
+              <w:t xml:space="preserve"> </w:t>
+            </w:r>
+            <w:r>
+              <w:t xml:space="preserve">in</w:t>
+            </w:r>
+            <w:r>
+              <w:t xml:space="preserve"> </w:t>
+            </w:r>
+            <w:r>
+              <w:rPr>
+                <w:rStyle w:val="VerbatimChar"/>
+              </w:rPr>
+              <w:t xml:space="preserve">design/ram</w:t>
+            </w:r>
+            <w:r>
+              <w:t xml:space="preserve">). No change in behaviour</w:t>
+            </w:r>
+          </w:p>
+        </w:tc>
+      </w:tr>
     </w:tbl>
     <w:bookmarkEnd w:id="26"/>
     <w:bookmarkStart w:id="27" w:name="overview"/>
@@ -733,7 +879,7 @@
         <w:t xml:space="preserve"> </w:t>
       </w:r>
       <w:r>
-        <w:t xml:space="preserve">are the on-chip RAMs of QSOC. Each is one instance of</w:t>
+        <w:t xml:space="preserve">are the on-chip RAMs of QSOC. They are two blocks with one design:</w:t>
       </w:r>
       <w:r>
         <w:t xml:space="preserve"> </w:t>
@@ -742,10 +888,25 @@
         <w:rPr>
           <w:rStyle w:val="VerbatimChar"/>
         </w:rPr>
-        <w:t xml:space="preserve">m_qnsc_wrap_axi4_sram</w:t>
-      </w:r>
-      <w:r>
-        <w:t xml:space="preserve">: the upstream</w:t>
+        <w:t xml:space="preserve">m_qnsc_wrap_isram</w:t>
+      </w:r>
+      <w:r>
+        <w:t xml:space="preserve"> </w:t>
+      </w:r>
+      <w:r>
+        <w:t xml:space="preserve">and</w:t>
+      </w:r>
+      <w:r>
+        <w:t xml:space="preserve"> </w:t>
+      </w:r>
+      <w:r>
+        <w:rPr>
+          <w:rStyle w:val="VerbatimChar"/>
+        </w:rPr>
+        <w:t xml:space="preserve">m_qnsc_wrap_dsram</w:t>
+      </w:r>
+      <w:r>
+        <w:t xml:space="preserve">, each the upstream</w:t>
       </w:r>
       <w:r>
         <w:t xml:space="preserve"> </w:t>
@@ -757,13 +918,13 @@
         <w:t xml:space="preserve">AXI4-SRAM-CONTROLLER</w:t>
       </w:r>
       <w:r>
-        <w:t xml:space="preserve">, unmodified, plus a</w:t>
-      </w:r>
-      <w:r>
-        <w:t xml:space="preserve"> </w:t>
-      </w:r>
-      <w:r>
-        <w:t xml:space="preserve">write-strobe FIFO, in front of an SMIC 28 nm single-port SRAM macro. The block does</w:t>
+        <w:t xml:space="preserve">,</w:t>
+      </w:r>
+      <w:r>
+        <w:t xml:space="preserve"> </w:t>
+      </w:r>
+      <w:r>
+        <w:t xml:space="preserve">unmodified, plus a write-strobe FIFO, in front of an SMIC 28 nm single-port SRAM macro. The block does</w:t>
       </w:r>
       <w:r>
         <w:t xml:space="preserve"> </w:t>
@@ -1151,7 +1312,7 @@
         <w:pStyle w:val="BodyText"/>
       </w:pPr>
       <w:r>
-        <w:t xml:space="preserve">File</w:t>
+        <w:t xml:space="preserve">Files</w:t>
       </w:r>
       <w:r>
         <w:t xml:space="preserve"> </w:t>
@@ -1160,10 +1321,31 @@
         <w:rPr>
           <w:rStyle w:val="VerbatimChar"/>
         </w:rPr>
-        <w:t xml:space="preserve">design/ram/rtl/m_qnsc_wrap_axi4_sram.sv</w:t>
-      </w:r>
-      <w:r>
-        <w:t xml:space="preserve">, owner Nghia Van Trong.</w:t>
+        <w:t xml:space="preserve">design/isram/rtl/m_qnsc_wrap_isram.sv</w:t>
+      </w:r>
+      <w:r>
+        <w:t xml:space="preserve"> </w:t>
+      </w:r>
+      <w:r>
+        <w:t xml:space="preserve">and</w:t>
+      </w:r>
+      <w:r>
+        <w:t xml:space="preserve"> </w:t>
+      </w:r>
+      <w:r>
+        <w:rPr>
+          <w:rStyle w:val="VerbatimChar"/>
+        </w:rPr>
+        <w:t xml:space="preserve">design/dsram/rtl/m_qnsc_wrap_dsram.sv</w:t>
+      </w:r>
+      <w:r>
+        <w:t xml:space="preserve">,</w:t>
+      </w:r>
+      <w:r>
+        <w:t xml:space="preserve"> </w:t>
+      </w:r>
+      <w:r>
+        <w:t xml:space="preserve">owner Nghia Van Trong.</w:t>
       </w:r>
     </w:p>
     <w:bookmarkEnd w:id="27"/>
@@ -1457,7 +1639,7 @@
               <a:graphicData uri="http://schemas.openxmlformats.org/drawingml/2006/picture">
                 <pic:pic>
                   <pic:nvPicPr>
-                    <pic:cNvPr descr="../img/fig_ram_simple.png" id="31" name="Picture"/>
+                    <pic:cNvPr descr="../figures/img/fig_ram_simple.png" id="31" name="Picture"/>
                     <pic:cNvPicPr>
                       <a:picLocks noChangeArrowheads="1" noChangeAspect="1"/>
                     </pic:cNvPicPr>
@@ -3601,7 +3783,7 @@
         <w:pStyle w:val="Tablecaption0"/>
       </w:pPr>
       <w:r>
-        <w:t xml:space="preserve">Table 5-2. RAM parameters</w:t>
+        <w:t xml:space="preserve">Table 5-2. IP parameters, fixed inside each wrapper</w:t>
       </w:r>
     </w:p>
     <w:tbl>
@@ -3610,7 +3792,7 @@
         <w:tblW w:type="pct" w:w="5000"/>
         <w:tblLayout w:type="fixed"/>
         <w:tblLook w:firstRow="1" w:lastRow="0" w:firstColumn="0" w:lastColumn="0" w:noHBand="0" w:noVBand="0" w:val="0020"/>
-        <w:tblCaption w:val="RAM parameters"/>
+        <w:tblCaption w:val="IP parameters, fixed inside each wrapper"/>
       </w:tblPr>
       <w:tblGrid>
         <w:gridCol w:w="1697"/>
@@ -6012,7 +6194,7 @@
         <w:pStyle w:val="Tablecaption0"/>
       </w:pPr>
       <w:r>
-        <w:t xml:space="preserve">Table 8-1. The two instances</w:t>
+        <w:t xml:space="preserve">Table 8-1. The two blocks</w:t>
       </w:r>
     </w:p>
     <w:tbl>
@@ -6020,7 +6202,7 @@
         <w:tblStyle w:val="TableGrid"/>
         <w:tblW w:type="auto" w:w="0"/>
         <w:tblLook w:firstRow="1" w:lastRow="0" w:firstColumn="0" w:lastColumn="0" w:noHBand="0" w:noVBand="0" w:val="0020"/>
-        <w:tblCaption w:val="The two instances"/>
+        <w:tblCaption w:val="The two blocks"/>
       </w:tblPr>
       <w:tblGrid>
         <w:gridCol w:w="1980"/>
@@ -6040,7 +6222,7 @@
               <w:jc w:val="left"/>
             </w:pPr>
             <w:r>
-              <w:t xml:space="preserve">Instance</w:t>
+              <w:t xml:space="preserve">Block</w:t>
             </w:r>
           </w:p>
         </w:tc>
@@ -6211,7 +6393,7 @@
         <w:pStyle w:val="BodyText"/>
       </w:pPr>
       <w:r>
-        <w:t xml:space="preserve">The instances differ only in</w:t>
+        <w:t xml:space="preserve">The two wrappers differ only in</w:t>
       </w:r>
       <w:r>
         <w:t xml:space="preserve"> </w:t>
@@ -6221,6 +6403,24 @@
           <w:rStyle w:val="VerbatimChar"/>
         </w:rPr>
         <w:t xml:space="preserve">PARA_SRAM_DEPTH</w:t>
+      </w:r>
+      <w:r>
+        <w:t xml:space="preserve">; neither has a parameter. One of</w:t>
+      </w:r>
+      <w:r>
+        <w:t xml:space="preserve"> </w:t>
+      </w:r>
+      <w:r>
+        <w:t xml:space="preserve">each in</w:t>
+      </w:r>
+      <w:r>
+        <w:t xml:space="preserve"> </w:t>
+      </w:r>
+      <w:r>
+        <w:rPr>
+          <w:rStyle w:val="VerbatimChar"/>
+        </w:rPr>
+        <w:t xml:space="preserve">design/top</w:t>
       </w:r>
       <w:r>
         <w:t xml:space="preserve">. Each decode window (section 1) equals its macro</w:t>
@@ -8848,7 +9048,7 @@
       <w:rPr>
         <w:szCs w:val="26"/>
       </w:rPr>
-      <w:t>V2.3</w:t>
+      <w:t>V2.4</w:t>
     </w:r>
     <w:r>
       <w:rPr>

</xml_diff>

<commit_message>
docs: requirement ids for ram, sysdbg, timer; w1c and rw0c access names; uart int
- RAM V2.5, SYSDBG V3.2, TIMER V2.6: every check of section 12 carries an
  ID (RAM_NNN, SYSDBG_NNN, TIMER_NNN), as the other MAS do, so tests can
  trace to them. No change in behaviour.
- Template: access types W1C and RW0C defined; RW0C added to the allowed
  list (WDT uses it). WDT V1.1 writes INTR_STATE as W1C, not rw1c.
- UART V3.1: the interrupt source is apb_uart INT, as the contract and
  INTMAP name it; irq_o is its source inside obi_uart.
</commit_message>
<xml_diff>
--- a/doc/specs/docx/QNSC_RAM_MAS.docx
+++ b/doc/specs/docx/QNSC_RAM_MAS.docx
@@ -15,7 +15,7 @@
         <w:pStyle w:val="Subtitle"/>
       </w:pPr>
       <w:r>
-        <w:t xml:space="preserve">MICRO-ARCHITECTURE SPECIFICATION – V2.4</w:t>
+        <w:t xml:space="preserve">MICRO-ARCHITECTURE SPECIFICATION – V2.5</w:t>
       </w:r>
     </w:p>
     <w:p>
@@ -839,6 +839,77 @@
           </w:p>
         </w:tc>
       </w:tr>
+      <w:tr>
+        <w:tc>
+          <w:tcPr/>
+          <w:p>
+            <w:pPr>
+              <w:pStyle w:val="Compact"/>
+              <w:jc w:val="left"/>
+            </w:pPr>
+            <w:r>
+              <w:t xml:space="preserve">V2.5</w:t>
+            </w:r>
+          </w:p>
+        </w:tc>
+        <w:tc>
+          <w:tcPr/>
+          <w:p>
+            <w:pPr>
+              <w:pStyle w:val="Compact"/>
+              <w:jc w:val="left"/>
+            </w:pPr>
+            <w:r>
+              <w:t xml:space="preserve">2026-09-30</w:t>
+            </w:r>
+          </w:p>
+        </w:tc>
+        <w:tc>
+          <w:tcPr/>
+          <w:p>
+            <w:pPr>
+              <w:pStyle w:val="Compact"/>
+              <w:jc w:val="left"/>
+            </w:pPr>
+            <w:r>
+              <w:t xml:space="preserve">Nghia VT</w:t>
+            </w:r>
+          </w:p>
+        </w:tc>
+        <w:tc>
+          <w:tcPr/>
+          <w:p>
+            <w:pPr>
+              <w:pStyle w:val="Compact"/>
+              <w:jc w:val="left"/>
+            </w:pPr>
+            <w:r>
+              <w:t xml:space="preserve">–</w:t>
+            </w:r>
+          </w:p>
+        </w:tc>
+        <w:tc>
+          <w:tcPr/>
+          <w:p>
+            <w:pPr>
+              <w:pStyle w:val="Compact"/>
+              <w:jc w:val="left"/>
+            </w:pPr>
+            <w:r>
+              <w:t xml:space="preserve">Section 12: every check carries an ID (</w:t>
+            </w:r>
+            <w:r>
+              <w:rPr>
+                <w:rStyle w:val="VerbatimChar"/>
+              </w:rPr>
+              <w:t xml:space="preserve">&lt;BLOCK&gt;_NNN</w:t>
+            </w:r>
+            <w:r>
+              <w:t xml:space="preserve">), for traceability to tests. No change in behaviour</w:t>
+            </w:r>
+          </w:p>
+        </w:tc>
+      </w:tr>
     </w:tbl>
     <w:bookmarkEnd w:id="26"/>
     <w:bookmarkStart w:id="27" w:name="overview"/>
@@ -7851,6 +7922,15 @@
         <w:jc w:val="left"/>
       </w:pPr>
       <w:r>
+        <w:rPr>
+          <w:rStyle w:val="VerbatimChar"/>
+        </w:rPr>
+        <w:t xml:space="preserve">RAM_001</w:t>
+      </w:r>
+      <w:r>
+        <w:t xml:space="preserve"> </w:t>
+      </w:r>
+      <w:r>
         <w:t xml:space="preserve">Each of the 15 non-zero</w:t>
       </w:r>
       <w:r>
@@ -7894,6 +7974,15 @@
         <w:jc w:val="left"/>
       </w:pPr>
       <w:r>
+        <w:rPr>
+          <w:rStyle w:val="VerbatimChar"/>
+        </w:rPr>
+        <w:t xml:space="preserve">RAM_002</w:t>
+      </w:r>
+      <w:r>
+        <w:t xml:space="preserve"> </w:t>
+      </w:r>
+      <w:r>
         <w:t xml:space="preserve">Assertion:</w:t>
       </w:r>
       <w:r>
@@ -7937,6 +8026,15 @@
         <w:jc w:val="left"/>
       </w:pPr>
       <w:r>
+        <w:rPr>
+          <w:rStyle w:val="VerbatimChar"/>
+        </w:rPr>
+        <w:t xml:space="preserve">RAM_003</w:t>
+      </w:r>
+      <w:r>
+        <w:t xml:space="preserve"> </w:t>
+      </w:r>
+      <w:r>
         <w:t xml:space="preserve">A C program writing</w:t>
       </w:r>
       <w:r>
@@ -7980,6 +8078,15 @@
         <w:jc w:val="left"/>
       </w:pPr>
       <w:r>
+        <w:rPr>
+          <w:rStyle w:val="VerbatimChar"/>
+        </w:rPr>
+        <w:t xml:space="preserve">RAM_004</w:t>
+      </w:r>
+      <w:r>
+        <w:t xml:space="preserve"> </w:t>
+      </w:r>
+      <w:r>
         <w:t xml:space="preserve">Every value of the timing table of 7.1, measured at the block ports.</w:t>
       </w:r>
     </w:p>
@@ -7996,6 +8103,15 @@
         <w:rPr>
           <w:rStyle w:val="VerbatimChar"/>
         </w:rPr>
+        <w:t xml:space="preserve">RAM_005</w:t>
+      </w:r>
+      <w:r>
+        <w:t xml:space="preserve"> </w:t>
+      </w:r>
+      <w:r>
+        <w:rPr>
+          <w:rStyle w:val="VerbatimChar"/>
+        </w:rPr>
         <w:t xml:space="preserve">B</w:t>
       </w:r>
       <w:r>
@@ -8030,6 +8146,15 @@
         <w:jc w:val="left"/>
       </w:pPr>
       <w:r>
+        <w:rPr>
+          <w:rStyle w:val="VerbatimChar"/>
+        </w:rPr>
+        <w:t xml:space="preserve">RAM_006</w:t>
+      </w:r>
+      <w:r>
+        <w:t xml:space="preserve"> </w:t>
+      </w:r>
+      <w:r>
         <w:t xml:space="preserve">Against an independent address model, aligned WRAP gives INCR addresses – 7.4.</w:t>
       </w:r>
     </w:p>
@@ -8046,6 +8171,15 @@
         <w:rPr>
           <w:rStyle w:val="VerbatimChar"/>
         </w:rPr>
+        <w:t xml:space="preserve">RAM_007</w:t>
+      </w:r>
+      <w:r>
+        <w:t xml:space="preserve"> </w:t>
+      </w:r>
+      <w:r>
+        <w:rPr>
+          <w:rStyle w:val="VerbatimChar"/>
+        </w:rPr>
         <w:t xml:space="preserve">o_mem_addr</w:t>
       </w:r>
       <w:r>
@@ -8095,6 +8229,15 @@
         <w:rPr>
           <w:rStyle w:val="VerbatimChar"/>
         </w:rPr>
+        <w:t xml:space="preserve">RAM_008</w:t>
+      </w:r>
+      <w:r>
+        <w:t xml:space="preserve"> </w:t>
+      </w:r>
+      <w:r>
+        <w:rPr>
+          <w:rStyle w:val="VerbatimChar"/>
+        </w:rPr>
         <w:t xml:space="preserve">BRESP</w:t>
       </w:r>
       <w:r>
@@ -8144,6 +8287,15 @@
         <w:jc w:val="left"/>
       </w:pPr>
       <w:r>
+        <w:rPr>
+          <w:rStyle w:val="VerbatimChar"/>
+        </w:rPr>
+        <w:t xml:space="preserve">RAM_009</w:t>
+      </w:r>
+      <w:r>
+        <w:t xml:space="preserve"> </w:t>
+      </w:r>
+      <w:r>
         <w:t xml:space="preserve">Reset values of 7.6; a pattern survives an</w:t>
       </w:r>
       <w:r>
@@ -8172,6 +8324,15 @@
         <w:jc w:val="left"/>
       </w:pPr>
       <w:r>
+        <w:rPr>
+          <w:rStyle w:val="VerbatimChar"/>
+        </w:rPr>
+        <w:t xml:space="preserve">RAM_010</w:t>
+      </w:r>
+      <w:r>
+        <w:t xml:space="preserve"> </w:t>
+      </w:r>
+      <w:r>
         <w:t xml:space="preserve">Macro pin tie-offs match the databook – section 10.</w:t>
       </w:r>
     </w:p>
@@ -8184,6 +8345,15 @@
         </w:numPr>
         <w:jc w:val="left"/>
       </w:pPr>
+      <w:r>
+        <w:rPr>
+          <w:rStyle w:val="VerbatimChar"/>
+        </w:rPr>
+        <w:t xml:space="preserve">RAM_011</w:t>
+      </w:r>
+      <w:r>
+        <w:t xml:space="preserve"> </w:t>
+      </w:r>
       <w:r>
         <w:t xml:space="preserve">The vendored</w:t>
       </w:r>
@@ -9048,7 +9218,7 @@
       <w:rPr>
         <w:szCs w:val="26"/>
       </w:rPr>
-      <w:t>V2.4</w:t>
+      <w:t>V2.5</w:t>
     </w:r>
     <w:r>
       <w:rPr>

</xml_diff>

<commit_message>
docs(ram): rebuild QNSC_RAM_MAS.docx for V2.5
</commit_message>
<xml_diff>
--- a/doc/specs/docx/QNSC_RAM_MAS.docx
+++ b/doc/specs/docx/QNSC_RAM_MAS.docx
@@ -15,7 +15,7 @@
         <w:pStyle w:val="Subtitle"/>
       </w:pPr>
       <w:r>
-        <w:t xml:space="preserve">MICRO-ARCHITECTURE SPECIFICATION – V2.4</w:t>
+        <w:t xml:space="preserve">MICRO-ARCHITECTURE SPECIFICATION – V2.5</w:t>
       </w:r>
     </w:p>
     <w:p>
@@ -839,6 +839,125 @@
           </w:p>
         </w:tc>
       </w:tr>
+      <w:tr>
+        <w:tc>
+          <w:tcPr/>
+          <w:p>
+            <w:pPr>
+              <w:pStyle w:val="Compact"/>
+              <w:jc w:val="left"/>
+            </w:pPr>
+            <w:r>
+              <w:t xml:space="preserve">V2.5</w:t>
+            </w:r>
+          </w:p>
+        </w:tc>
+        <w:tc>
+          <w:tcPr/>
+          <w:p>
+            <w:pPr>
+              <w:pStyle w:val="Compact"/>
+              <w:jc w:val="left"/>
+            </w:pPr>
+            <w:r>
+              <w:t xml:space="preserve">2026-10-15</w:t>
+            </w:r>
+          </w:p>
+        </w:tc>
+        <w:tc>
+          <w:tcPr/>
+          <w:p>
+            <w:pPr>
+              <w:pStyle w:val="Compact"/>
+              <w:jc w:val="left"/>
+            </w:pPr>
+            <w:r>
+              <w:t xml:space="preserve">Nghia VT</w:t>
+            </w:r>
+          </w:p>
+        </w:tc>
+        <w:tc>
+          <w:tcPr/>
+          <w:p>
+            <w:pPr>
+              <w:pStyle w:val="Compact"/>
+              <w:jc w:val="left"/>
+            </w:pPr>
+            <w:r>
+              <w:t xml:space="preserve">–</w:t>
+            </w:r>
+          </w:p>
+        </w:tc>
+        <w:tc>
+          <w:tcPr/>
+          <w:p>
+            <w:pPr>
+              <w:pStyle w:val="Compact"/>
+              <w:jc w:val="left"/>
+            </w:pPr>
+            <w:r>
+              <w:t xml:space="preserve">Wrappers written and simulated.</w:t>
+            </w:r>
+            <w:r>
+              <w:t xml:space="preserve"> </w:t>
+            </w:r>
+            <w:r>
+              <w:rPr>
+                <w:rStyle w:val="VerbatimChar"/>
+              </w:rPr>
+              <w:t xml:space="preserve">PARA_LEN_WD</w:t>
+            </w:r>
+            <w:r>
+              <w:t xml:space="preserve"> </w:t>
+            </w:r>
+            <w:r>
+              <w:t xml:space="preserve">is 9, not 8: with 8, a 256-beat burst (</w:t>
+            </w:r>
+            <w:r>
+              <w:rPr>
+                <w:rStyle w:val="VerbatimChar"/>
+              </w:rPr>
+              <w:t xml:space="preserve">AxLEN</w:t>
+            </w:r>
+            <w:r>
+              <w:t xml:space="preserve"> </w:t>
+            </w:r>
+            <w:r>
+              <w:t xml:space="preserve">= 255) is dropped with no response (found in simulation, 7.2). Section 12 carries test IDs</w:t>
+            </w:r>
+            <w:r>
+              <w:t xml:space="preserve"> </w:t>
+            </w:r>
+            <w:r>
+              <w:rPr>
+                <w:rStyle w:val="VerbatimChar"/>
+              </w:rPr>
+              <w:t xml:space="preserve">RAM_001</w:t>
+            </w:r>
+            <w:r>
+              <w:t xml:space="preserve"> </w:t>
+            </w:r>
+            <w:r>
+              <w:t xml:space="preserve">to</w:t>
+            </w:r>
+            <w:r>
+              <w:t xml:space="preserve"> </w:t>
+            </w:r>
+            <w:r>
+              <w:rPr>
+                <w:rStyle w:val="VerbatimChar"/>
+              </w:rPr>
+              <w:t xml:space="preserve">RAM_012</w:t>
+            </w:r>
+            <w:r>
+              <w:t xml:space="preserve"> </w:t>
+            </w:r>
+            <w:r>
+              <w:t xml:space="preserve">and says which items are not simulated; the timing table of 7.1 is confirmed as written</w:t>
+            </w:r>
+          </w:p>
+        </w:tc>
+      </w:tr>
     </w:tbl>
     <w:bookmarkEnd w:id="26"/>
     <w:bookmarkStart w:id="27" w:name="overview"/>
@@ -4057,7 +4176,7 @@
               <w:jc w:val="right"/>
             </w:pPr>
             <w:r>
-              <w:t xml:space="preserve">8</w:t>
+              <w:t xml:space="preserve">9</w:t>
             </w:r>
           </w:p>
         </w:tc>
@@ -4069,17 +4188,23 @@
               <w:jc w:val="right"/>
             </w:pPr>
             <w:r>
-              <w:t xml:space="preserve">8</w:t>
-            </w:r>
-          </w:p>
-        </w:tc>
-        <w:tc>
-          <w:tcPr/>
-          <w:p>
-            <w:pPr>
-              <w:pStyle w:val="Compact"/>
-              <w:jc w:val="left"/>
-            </w:pPr>
+              <w:t xml:space="preserve">9</w:t>
+            </w:r>
+          </w:p>
+        </w:tc>
+        <w:tc>
+          <w:tcPr/>
+          <w:p>
+            <w:pPr>
+              <w:pStyle w:val="Compact"/>
+              <w:jc w:val="left"/>
+            </w:pPr>
+            <w:r>
+              <w:t xml:space="preserve">Width of the controller’s beat counter, which holds</w:t>
+            </w:r>
+            <w:r>
+              <w:t xml:space="preserve"> </w:t>
+            </w:r>
             <w:r>
               <w:rPr>
                 <w:rStyle w:val="VerbatimChar"/>
@@ -4090,7 +4215,22 @@
               <w:t xml:space="preserve"> </w:t>
             </w:r>
             <w:r>
-              <w:t xml:space="preserve">width</w:t>
+              <w:t xml:space="preserve">+ 1: 9 bits, bit 8 of</w:t>
+            </w:r>
+            <w:r>
+              <w:t xml:space="preserve"> </w:t>
+            </w:r>
+            <w:r>
+              <w:rPr>
+                <w:rStyle w:val="VerbatimChar"/>
+              </w:rPr>
+              <w:t xml:space="preserve">AxLEN</w:t>
+            </w:r>
+            <w:r>
+              <w:t xml:space="preserve"> </w:t>
+            </w:r>
+            <w:r>
+              <w:t xml:space="preserve">tied 0. At 8, a 256-beat burst is dropped – 7.2</w:t>
             </w:r>
           </w:p>
         </w:tc>
@@ -5430,6 +5570,122 @@
         <w:pStyle w:val="BodyText"/>
       </w:pPr>
       <w:r>
+        <w:t xml:space="preserve">The counter is loaded with</w:t>
+      </w:r>
+      <w:r>
+        <w:t xml:space="preserve"> </w:t>
+      </w:r>
+      <w:r>
+        <w:rPr>
+          <w:rStyle w:val="VerbatimChar"/>
+        </w:rPr>
+        <w:t xml:space="preserve">AxLEN</w:t>
+      </w:r>
+      <w:r>
+        <w:t xml:space="preserve"> </w:t>
+      </w:r>
+      <w:r>
+        <w:t xml:space="preserve">+ 1 and is</w:t>
+      </w:r>
+      <w:r>
+        <w:t xml:space="preserve"> </w:t>
+      </w:r>
+      <w:r>
+        <w:rPr>
+          <w:rStyle w:val="VerbatimChar"/>
+        </w:rPr>
+        <w:t xml:space="preserve">PARA_LEN_WD</w:t>
+      </w:r>
+      <w:r>
+        <w:t xml:space="preserve"> </w:t>
+      </w:r>
+      <w:r>
+        <w:t xml:space="preserve">bits wide. With the IP’s</w:t>
+      </w:r>
+      <w:r>
+        <w:t xml:space="preserve"> </w:t>
+      </w:r>
+      <w:r>
+        <w:t xml:space="preserve">default of 8 bits,</w:t>
+      </w:r>
+      <w:r>
+        <w:t xml:space="preserve"> </w:t>
+      </w:r>
+      <w:r>
+        <w:rPr>
+          <w:rStyle w:val="VerbatimChar"/>
+        </w:rPr>
+        <w:t xml:space="preserve">AxLEN</w:t>
+      </w:r>
+      <w:r>
+        <w:t xml:space="preserve"> </w:t>
+      </w:r>
+      <w:r>
+        <w:t xml:space="preserve">= 255 loads 0: the burst is finished before it starts, no</w:t>
+      </w:r>
+      <w:r>
+        <w:t xml:space="preserve"> </w:t>
+      </w:r>
+      <w:r>
+        <w:t xml:space="preserve">beat reaches the FIFOs and no response comes back, and a write leaves the write-data FIFO</w:t>
+      </w:r>
+      <w:r>
+        <w:t xml:space="preserve"> </w:t>
+      </w:r>
+      <w:r>
+        <w:t xml:space="preserve">full. The wrappers therefore set</w:t>
+      </w:r>
+      <w:r>
+        <w:t xml:space="preserve"> </w:t>
+      </w:r>
+      <w:r>
+        <w:rPr>
+          <w:rStyle w:val="VerbatimChar"/>
+        </w:rPr>
+        <w:t xml:space="preserve">PARA_LEN_WD</w:t>
+      </w:r>
+      <w:r>
+        <w:t xml:space="preserve"> </w:t>
+      </w:r>
+      <w:r>
+        <w:t xml:space="preserve">= 9 and tie bit 8 of</w:t>
+      </w:r>
+      <w:r>
+        <w:t xml:space="preserve"> </w:t>
+      </w:r>
+      <w:r>
+        <w:rPr>
+          <w:rStyle w:val="VerbatimChar"/>
+        </w:rPr>
+        <w:t xml:space="preserve">AxLEN</w:t>
+      </w:r>
+      <w:r>
+        <w:t xml:space="preserve"> </w:t>
+      </w:r>
+      <w:r>
+        <w:t xml:space="preserve">to 0, which</w:t>
+      </w:r>
+      <w:r>
+        <w:t xml:space="preserve"> </w:t>
+      </w:r>
+      <w:r>
+        <w:t xml:space="preserve">the controller accepts unmodified. Found in simulation (</w:t>
+      </w:r>
+      <w:r>
+        <w:rPr>
+          <w:rStyle w:val="VerbatimChar"/>
+        </w:rPr>
+        <w:t xml:space="preserve">RAM_012</w:t>
+      </w:r>
+      <w:r>
+        <w:t xml:space="preserve">).</w:t>
+      </w:r>
+    </w:p>
+    <w:p>
+      <w:pPr>
+        <w:pStyle w:val="BodyText"/>
+      </w:pPr>
+      <w:r>
         <w:t xml:space="preserve">The macro word address is IP address bits</w:t>
       </w:r>
       <w:r>
@@ -7838,7 +8094,82 @@
         <w:pStyle w:val="BodyText"/>
       </w:pPr>
       <w:r>
-        <w:t xml:space="preserve">Checks QSOC adds:</w:t>
+        <w:t xml:space="preserve">Checks QSOC adds.</w:t>
+      </w:r>
+      <w:r>
+        <w:t xml:space="preserve"> </w:t>
+      </w:r>
+      <w:r>
+        <w:rPr>
+          <w:rStyle w:val="VerbatimChar"/>
+        </w:rPr>
+        <w:t xml:space="preserve">dv/isram</w:t>
+      </w:r>
+      <w:r>
+        <w:t xml:space="preserve"> </w:t>
+      </w:r>
+      <w:r>
+        <w:t xml:space="preserve">and</w:t>
+      </w:r>
+      <w:r>
+        <w:t xml:space="preserve"> </w:t>
+      </w:r>
+      <w:r>
+        <w:rPr>
+          <w:rStyle w:val="VerbatimChar"/>
+        </w:rPr>
+        <w:t xml:space="preserve">dv/dsram</w:t>
+      </w:r>
+      <w:r>
+        <w:t xml:space="preserve"> </w:t>
+      </w:r>
+      <w:r>
+        <w:t xml:space="preserve">run the same tests, in</w:t>
+      </w:r>
+      <w:r>
+        <w:t xml:space="preserve"> </w:t>
+      </w:r>
+      <w:r>
+        <w:rPr>
+          <w:rStyle w:val="VerbatimChar"/>
+        </w:rPr>
+        <w:t xml:space="preserve">dv/ram_common</w:t>
+      </w:r>
+      <w:r>
+        <w:t xml:space="preserve">,</w:t>
+      </w:r>
+      <w:r>
+        <w:t xml:space="preserve"> </w:t>
+      </w:r>
+      <w:r>
+        <w:t xml:space="preserve">against a macro model with byte enables and no reset;</w:t>
+      </w:r>
+      <w:r>
+        <w:t xml:space="preserve"> </w:t>
+      </w:r>
+      <w:r>
+        <w:rPr>
+          <w:rStyle w:val="VerbatimChar"/>
+        </w:rPr>
+        <w:t xml:space="preserve">make sim BLOCK=isram</w:t>
+      </w:r>
+      <w:r>
+        <w:t xml:space="preserve"> </w:t>
+      </w:r>
+      <w:r>
+        <w:t xml:space="preserve">and</w:t>
+      </w:r>
+      <w:r>
+        <w:t xml:space="preserve"> </w:t>
+      </w:r>
+      <w:r>
+        <w:rPr>
+          <w:rStyle w:val="VerbatimChar"/>
+        </w:rPr>
+        <w:t xml:space="preserve">make sim BLOCK=dsram</w:t>
+      </w:r>
+      <w:r>
+        <w:t xml:space="preserve">. Both blocks pass all of them.</w:t>
       </w:r>
     </w:p>
     <w:p>
@@ -7851,6 +8182,15 @@
         <w:jc w:val="left"/>
       </w:pPr>
       <w:r>
+        <w:rPr>
+          <w:rStyle w:val="VerbatimChar"/>
+        </w:rPr>
+        <w:t xml:space="preserve">RAM_001</w:t>
+      </w:r>
+      <w:r>
+        <w:t xml:space="preserve"> </w:t>
+      </w:r>
+      <w:r>
         <w:t xml:space="preserve">Each of the 15 non-zero</w:t>
       </w:r>
       <w:r>
@@ -7894,6 +8234,15 @@
         <w:jc w:val="left"/>
       </w:pPr>
       <w:r>
+        <w:rPr>
+          <w:rStyle w:val="VerbatimChar"/>
+        </w:rPr>
+        <w:t xml:space="preserve">RAM_002</w:t>
+      </w:r>
+      <w:r>
+        <w:t xml:space="preserve"> </w:t>
+      </w:r>
+      <w:r>
         <w:t xml:space="preserve">Assertion:</w:t>
       </w:r>
       <w:r>
@@ -7925,6 +8274,12 @@
       </w:r>
       <w:r>
         <w:t xml:space="preserve">occupancy are equal in every cycle – 7.3.</w:t>
+      </w:r>
+      <w:r>
+        <w:t xml:space="preserve"> </w:t>
+      </w:r>
+      <w:r>
+        <w:t xml:space="preserve">The assertion runs in every cycle of every test; the test fills the FIFOs on purpose.</w:t>
       </w:r>
     </w:p>
     <w:p>
@@ -7969,6 +8324,55 @@
       <w:r>
         <w:t xml:space="preserve">data leaves neighbours intact – 7.3.</w:t>
       </w:r>
+      <w:r>
+        <w:t xml:space="preserve"> </w:t>
+      </w:r>
+      <w:r>
+        <w:rPr>
+          <w:b/>
+          <w:bCs/>
+        </w:rPr>
+        <w:t xml:space="preserve">Not simulated:</w:t>
+      </w:r>
+      <w:r>
+        <w:t xml:space="preserve"> </w:t>
+      </w:r>
+      <w:r>
+        <w:t xml:space="preserve">it needs the CPU and</w:t>
+      </w:r>
+      <w:r>
+        <w:t xml:space="preserve"> </w:t>
+      </w:r>
+      <w:r>
+        <w:rPr>
+          <w:rStyle w:val="VerbatimChar"/>
+        </w:rPr>
+        <w:t xml:space="preserve">CPU2AXI</w:t>
+      </w:r>
+      <w:r>
+        <w:t xml:space="preserve">.</w:t>
+      </w:r>
+      <w:r>
+        <w:t xml:space="preserve"> </w:t>
+      </w:r>
+      <w:r>
+        <w:rPr>
+          <w:rStyle w:val="VerbatimChar"/>
+        </w:rPr>
+        <w:t xml:space="preserve">RAM_001</w:t>
+      </w:r>
+      <w:r>
+        <w:t xml:space="preserve"> </w:t>
+      </w:r>
+      <w:r>
+        <w:t xml:space="preserve">covers the same bytes at</w:t>
+      </w:r>
+      <w:r>
+        <w:t xml:space="preserve"> </w:t>
+      </w:r>
+      <w:r>
+        <w:t xml:space="preserve">the port.</w:t>
+      </w:r>
     </w:p>
     <w:p>
       <w:pPr>
@@ -7980,6 +8384,15 @@
         <w:jc w:val="left"/>
       </w:pPr>
       <w:r>
+        <w:rPr>
+          <w:rStyle w:val="VerbatimChar"/>
+        </w:rPr>
+        <w:t xml:space="preserve">RAM_004</w:t>
+      </w:r>
+      <w:r>
+        <w:t xml:space="preserve"> </w:t>
+      </w:r>
+      <w:r>
         <w:t xml:space="preserve">Every value of the timing table of 7.1, measured at the block ports.</w:t>
       </w:r>
     </w:p>
@@ -7996,6 +8409,15 @@
         <w:rPr>
           <w:rStyle w:val="VerbatimChar"/>
         </w:rPr>
+        <w:t xml:space="preserve">RAM_005</w:t>
+      </w:r>
+      <w:r>
+        <w:t xml:space="preserve"> </w:t>
+      </w:r>
+      <w:r>
+        <w:rPr>
+          <w:rStyle w:val="VerbatimChar"/>
+        </w:rPr>
         <w:t xml:space="preserve">B</w:t>
       </w:r>
       <w:r>
@@ -8030,6 +8452,15 @@
         <w:jc w:val="left"/>
       </w:pPr>
       <w:r>
+        <w:rPr>
+          <w:rStyle w:val="VerbatimChar"/>
+        </w:rPr>
+        <w:t xml:space="preserve">RAM_006</w:t>
+      </w:r>
+      <w:r>
+        <w:t xml:space="preserve"> </w:t>
+      </w:r>
+      <w:r>
         <w:t xml:space="preserve">Against an independent address model, aligned WRAP gives INCR addresses – 7.4.</w:t>
       </w:r>
     </w:p>
@@ -8046,6 +8477,15 @@
         <w:rPr>
           <w:rStyle w:val="VerbatimChar"/>
         </w:rPr>
+        <w:t xml:space="preserve">RAM_007</w:t>
+      </w:r>
+      <w:r>
+        <w:t xml:space="preserve"> </w:t>
+      </w:r>
+      <w:r>
+        <w:rPr>
+          <w:rStyle w:val="VerbatimChar"/>
+        </w:rPr>
         <w:t xml:space="preserve">o_mem_addr</w:t>
       </w:r>
       <w:r>
@@ -8095,6 +8535,15 @@
         <w:rPr>
           <w:rStyle w:val="VerbatimChar"/>
         </w:rPr>
+        <w:t xml:space="preserve">RAM_008</w:t>
+      </w:r>
+      <w:r>
+        <w:t xml:space="preserve"> </w:t>
+      </w:r>
+      <w:r>
+        <w:rPr>
+          <w:rStyle w:val="VerbatimChar"/>
+        </w:rPr>
         <w:t xml:space="preserve">BRESP</w:t>
       </w:r>
       <w:r>
@@ -8144,6 +8593,15 @@
         <w:jc w:val="left"/>
       </w:pPr>
       <w:r>
+        <w:rPr>
+          <w:rStyle w:val="VerbatimChar"/>
+        </w:rPr>
+        <w:t xml:space="preserve">RAM_009</w:t>
+      </w:r>
+      <w:r>
+        <w:t xml:space="preserve"> </w:t>
+      </w:r>
+      <w:r>
         <w:t xml:space="preserve">Reset values of 7.6; a pattern survives an</w:t>
       </w:r>
       <w:r>
@@ -8174,6 +8632,28 @@
       <w:r>
         <w:t xml:space="preserve">Macro pin tie-offs match the databook – section 10.</w:t>
       </w:r>
+      <w:r>
+        <w:t xml:space="preserve"> </w:t>
+      </w:r>
+      <w:r>
+        <w:rPr>
+          <w:b/>
+          <w:bCs/>
+        </w:rPr>
+        <w:t xml:space="preserve">Not simulated:</w:t>
+      </w:r>
+      <w:r>
+        <w:t xml:space="preserve"> </w:t>
+      </w:r>
+      <w:r>
+        <w:t xml:space="preserve">the</w:t>
+      </w:r>
+      <w:r>
+        <w:t xml:space="preserve"> </w:t>
+      </w:r>
+      <w:r>
+        <w:t xml:space="preserve">testbench has a behavioural model, not the macro. It belongs to physical design.</w:t>
+      </w:r>
     </w:p>
     <w:p>
       <w:pPr>
@@ -8215,7 +8695,80 @@
         <w:t xml:space="preserve"> </w:t>
       </w:r>
       <w:r>
-        <w:t xml:space="preserve">– section 4.</w:t>
+        <w:t xml:space="preserve">– section 4. Checked by CI</w:t>
+      </w:r>
+      <w:r>
+        <w:t xml:space="preserve"> </w:t>
+      </w:r>
+      <w:r>
+        <w:t xml:space="preserve">(</w:t>
+      </w:r>
+      <w:r>
+        <w:rPr>
+          <w:rStyle w:val="VerbatimChar"/>
+        </w:rPr>
+        <w:t xml:space="preserve">Vendor tree unmodified</w:t>
+      </w:r>
+      <w:r>
+        <w:t xml:space="preserve">), not by simulation.</w:t>
+      </w:r>
+    </w:p>
+    <w:p>
+      <w:pPr>
+        <w:pStyle w:val="Compact"/>
+        <w:numPr>
+          <w:ilvl w:val="0"/>
+          <w:numId w:val="1003"/>
+        </w:numPr>
+        <w:jc w:val="left"/>
+      </w:pPr>
+      <w:r>
+        <w:rPr>
+          <w:rStyle w:val="VerbatimChar"/>
+        </w:rPr>
+        <w:t xml:space="preserve">RAM_012</w:t>
+      </w:r>
+      <w:r>
+        <w:t xml:space="preserve"> </w:t>
+      </w:r>
+      <w:r>
+        <w:t xml:space="preserve">(added) INCR bursts of 1, 2, 3, 16, 17 and 256 beats, FIXED of 1 to 16, and</w:t>
+      </w:r>
+      <w:r>
+        <w:t xml:space="preserve"> </w:t>
+      </w:r>
+      <w:r>
+        <w:t xml:space="preserve">300 random bursts against a reference memory with</w:t>
+      </w:r>
+      <w:r>
+        <w:t xml:space="preserve"> </w:t>
+      </w:r>
+      <w:r>
+        <w:rPr>
+          <w:rStyle w:val="VerbatimChar"/>
+        </w:rPr>
+        <w:t xml:space="preserve">B</w:t>
+      </w:r>
+      <w:r>
+        <w:t xml:space="preserve"> </w:t>
+      </w:r>
+      <w:r>
+        <w:t xml:space="preserve">and</w:t>
+      </w:r>
+      <w:r>
+        <w:t xml:space="preserve"> </w:t>
+      </w:r>
+      <w:r>
+        <w:rPr>
+          <w:rStyle w:val="VerbatimChar"/>
+        </w:rPr>
+        <w:t xml:space="preserve">R</w:t>
+      </w:r>
+      <w:r>
+        <w:t xml:space="preserve"> </w:t>
+      </w:r>
+      <w:r>
+        <w:t xml:space="preserve">stalled at random – 7.2.</w:t>
       </w:r>
     </w:p>
     <w:bookmarkEnd w:id="47"/>
@@ -9048,7 +9601,7 @@
       <w:rPr>
         <w:szCs w:val="26"/>
       </w:rPr>
-      <w:t>V2.4</w:t>
+      <w:t>V2.5</w:t>
     </w:r>
     <w:r>
       <w:rPr>

</xml_diff>

<commit_message>
test(ram): RAM_013 states the write-response FIFO limit; MAS 7.1 and 11
With BREADY low, a ninth pending write response is dropped: the write
grant does not look at the response FIFO (8 entries). The data is written.
S_BUS allows two transactions in flight per port, so the bus should not
produce the case; not verified on the bus. RAM_013 delivers 8 held
responses, sees 8 of 10, and fails if that changes, so a change is a
decision. MAS accepted limit, DECISIONS D5, manifest note, READMEs.

RAM_008 says that its 4 KiB crossing burst is not legal AXI.
</commit_message>
<xml_diff>
--- a/doc/specs/docx/QNSC_RAM_MAS.docx
+++ b/doc/specs/docx/QNSC_RAM_MAS.docx
@@ -953,7 +953,7 @@
               <w:t xml:space="preserve"> </w:t>
             </w:r>
             <w:r>
-              <w:t xml:space="preserve">and says which items are not simulated; the timing table of 7.1 is confirmed as written</w:t>
+              <w:t xml:space="preserve">and says which items are not simulated; the timing table of 7.1 is confirmed as written. 7.1 and 11: the write-response FIFO drops a response beyond 8 pending (accepted limit, found in simulation)</w:t>
             </w:r>
           </w:p>
         </w:tc>
@@ -5107,6 +5107,186 @@
     </w:p>
     <w:p>
       <w:pPr>
+        <w:pStyle w:val="BodyText"/>
+      </w:pPr>
+      <w:r>
+        <w:rPr>
+          <w:rStyle w:val="VerbatimChar"/>
+          <w:b/>
+          <w:bCs/>
+        </w:rPr>
+        <w:t xml:space="preserve">BFIFO</w:t>
+      </w:r>
+      <w:r>
+        <w:rPr>
+          <w:b/>
+          <w:bCs/>
+        </w:rPr>
+        <w:t xml:space="preserve"> </w:t>
+      </w:r>
+      <w:r>
+        <w:rPr>
+          <w:b/>
+          <w:bCs/>
+        </w:rPr>
+        <w:t xml:space="preserve">has no back-pressure.</w:t>
+      </w:r>
+      <w:r>
+        <w:t xml:space="preserve"> </w:t>
+      </w:r>
+      <w:r>
+        <w:t xml:space="preserve">A write is granted whether or not</w:t>
+      </w:r>
+      <w:r>
+        <w:t xml:space="preserve"> </w:t>
+      </w:r>
+      <w:r>
+        <w:rPr>
+          <w:rStyle w:val="VerbatimChar"/>
+        </w:rPr>
+        <w:t xml:space="preserve">BFIFO</w:t>
+      </w:r>
+      <w:r>
+        <w:t xml:space="preserve"> </w:t>
+      </w:r>
+      <w:r>
+        <w:t xml:space="preserve">has room, so</w:t>
+      </w:r>
+      <w:r>
+        <w:t xml:space="preserve"> </w:t>
+      </w:r>
+      <w:r>
+        <w:t xml:space="preserve">with</w:t>
+      </w:r>
+      <w:r>
+        <w:t xml:space="preserve"> </w:t>
+      </w:r>
+      <w:r>
+        <w:rPr>
+          <w:rStyle w:val="VerbatimChar"/>
+        </w:rPr>
+        <w:t xml:space="preserve">BREADY</w:t>
+      </w:r>
+      <w:r>
+        <w:t xml:space="preserve"> </w:t>
+      </w:r>
+      <w:r>
+        <w:t xml:space="preserve">low the first 8 responses wait in the FIFO and a ninth is dropped, although</w:t>
+      </w:r>
+      <w:r>
+        <w:t xml:space="preserve"> </w:t>
+      </w:r>
+      <w:r>
+        <w:t xml:space="preserve">its data is written. The master then waits for a</w:t>
+      </w:r>
+      <w:r>
+        <w:t xml:space="preserve"> </w:t>
+      </w:r>
+      <w:r>
+        <w:rPr>
+          <w:rStyle w:val="VerbatimChar"/>
+        </w:rPr>
+        <w:t xml:space="preserve">B</w:t>
+      </w:r>
+      <w:r>
+        <w:t xml:space="preserve"> </w:t>
+      </w:r>
+      <w:r>
+        <w:t xml:space="preserve">that never comes (</w:t>
+      </w:r>
+      <w:r>
+        <w:rPr>
+          <w:rStyle w:val="VerbatimChar"/>
+        </w:rPr>
+        <w:t xml:space="preserve">RAM_013</w:t>
+      </w:r>
+      <w:r>
+        <w:t xml:space="preserve">). Reads are</w:t>
+      </w:r>
+      <w:r>
+        <w:t xml:space="preserve"> </w:t>
+      </w:r>
+      <w:r>
+        <w:t xml:space="preserve">protected: a read is issued only while</w:t>
+      </w:r>
+      <w:r>
+        <w:t xml:space="preserve"> </w:t>
+      </w:r>
+      <w:r>
+        <w:rPr>
+          <w:rStyle w:val="VerbatimChar"/>
+        </w:rPr>
+        <w:t xml:space="preserve">RFIFO</w:t>
+      </w:r>
+      <w:r>
+        <w:t xml:space="preserve"> </w:t>
+      </w:r>
+      <w:r>
+        <w:t xml:space="preserve">is not full.</w:t>
+      </w:r>
+      <w:r>
+        <w:t xml:space="preserve"> </w:t>
+      </w:r>
+      <w:r>
+        <w:rPr>
+          <w:rStyle w:val="VerbatimChar"/>
+        </w:rPr>
+        <w:t xml:space="preserve">S_BUS</w:t>
+      </w:r>
+      <w:r>
+        <w:t xml:space="preserve"> </w:t>
+      </w:r>
+      <w:r>
+        <w:t xml:space="preserve">is configured for two</w:t>
+      </w:r>
+      <w:r>
+        <w:t xml:space="preserve"> </w:t>
+      </w:r>
+      <w:r>
+        <w:t xml:space="preserve">transactions in flight per port (</w:t>
+      </w:r>
+      <w:r>
+        <w:rPr>
+          <w:rStyle w:val="VerbatimChar"/>
+        </w:rPr>
+        <w:t xml:space="preserve">Cfg.MaxMstTrans</w:t>
+      </w:r>
+      <w:r>
+        <w:t xml:space="preserve"> </w:t>
+      </w:r>
+      <w:r>
+        <w:t xml:space="preserve">=</w:t>
+      </w:r>
+      <w:r>
+        <w:t xml:space="preserve"> </w:t>
+      </w:r>
+      <w:r>
+        <w:rPr>
+          <w:rStyle w:val="VerbatimChar"/>
+        </w:rPr>
+        <w:t xml:space="preserve">MaxSlvTrans</w:t>
+      </w:r>
+      <w:r>
+        <w:t xml:space="preserve"> </w:t>
+      </w:r>
+      <w:r>
+        <w:t xml:space="preserve">= 2, S_BUS configuration</w:t>
+      </w:r>
+      <w:r>
+        <w:t xml:space="preserve"> </w:t>
+      </w:r>
+      <w:r>
+        <w:t xml:space="preserve">sheet), which should keep the pending responses far below 8; this is not verified on the</w:t>
+      </w:r>
+      <w:r>
+        <w:t xml:space="preserve"> </w:t>
+      </w:r>
+      <w:r>
+        <w:t xml:space="preserve">bus.</w:t>
+      </w:r>
+    </w:p>
+    <w:p>
+      <w:pPr>
         <w:pStyle w:val="Tablecaption0"/>
       </w:pPr>
       <w:r>
@@ -7981,195 +8161,7 @@
           <w:b/>
           <w:bCs/>
         </w:rPr>
-        <w:t xml:space="preserve">Open:</w:t>
-      </w:r>
-      <w:r>
-        <w:t xml:space="preserve"> </w:t>
-      </w:r>
-      <w:r>
-        <w:t xml:space="preserve">timing and area of both instances after synthesis.</w:t>
-      </w:r>
-    </w:p>
-    <w:bookmarkEnd w:id="46"/>
-    <w:bookmarkStart w:id="47" w:name="verification"/>
-    <w:p>
-      <w:pPr>
-        <w:pStyle w:val="Heading1"/>
-      </w:pPr>
-      <w:r>
-        <w:t xml:space="preserve">12. Verification</w:t>
-      </w:r>
-    </w:p>
-    <w:p>
-      <w:pPr>
-        <w:pStyle w:val="FirstParagraph"/>
-      </w:pPr>
-      <w:r>
-        <w:t xml:space="preserve">The IP’s regression runs unchanged against the controller alone:</w:t>
-      </w:r>
-      <w:r>
-        <w:t xml:space="preserve"> </w:t>
-      </w:r>
-      <w:r>
-        <w:rPr>
-          <w:rStyle w:val="VerbatimChar"/>
-        </w:rPr>
-        <w:t xml:space="preserve">nguyenquanicd/AXI4-SRAM-CONTROLLER</w:t>
-      </w:r>
-      <w:r>
-        <w:t xml:space="preserve"> </w:t>
-      </w:r>
-      <w:r>
-        <w:t xml:space="preserve">at</w:t>
-      </w:r>
-      <w:r>
-        <w:t xml:space="preserve"> </w:t>
-      </w:r>
-      <w:r>
-        <w:rPr>
-          <w:rStyle w:val="VerbatimChar"/>
-        </w:rPr>
-        <w:t xml:space="preserve">503d7cd98352378c09dff3930f7fdb0590ea643d</w:t>
-      </w:r>
-      <w:r>
-        <w:t xml:space="preserve">,</w:t>
-      </w:r>
-      <w:r>
-        <w:t xml:space="preserve"> </w:t>
-      </w:r>
-      <w:r>
-        <w:t xml:space="preserve">46 directed tests in</w:t>
-      </w:r>
-      <w:r>
-        <w:t xml:space="preserve"> </w:t>
-      </w:r>
-      <w:r>
-        <w:rPr>
-          <w:rStyle w:val="VerbatimChar"/>
-        </w:rPr>
-        <w:t xml:space="preserve">sim/vcs/tests/</w:t>
-      </w:r>
-      <w:r>
-        <w:t xml:space="preserve"> </w:t>
-      </w:r>
-      <w:r>
-        <w:t xml:space="preserve">on the Synopsys AXI VIP, self-checking in</w:t>
-      </w:r>
-      <w:r>
-        <w:t xml:space="preserve"> </w:t>
-      </w:r>
-      <w:r>
-        <w:rPr>
-          <w:rStyle w:val="VerbatimChar"/>
-        </w:rPr>
-        <w:t xml:space="preserve">sim/vcs/env/axi_svt_basic_env.sv</w:t>
-      </w:r>
-      <w:r>
-        <w:t xml:space="preserve">. Its macro model</w:t>
-      </w:r>
-      <w:r>
-        <w:t xml:space="preserve"> </w:t>
-      </w:r>
-      <w:r>
-        <w:rPr>
-          <w:rStyle w:val="VerbatimChar"/>
-        </w:rPr>
-        <w:t xml:space="preserve">sim/vcs/env/m_vlsi_sram_sp.sv</w:t>
-      </w:r>
-      <w:r>
-        <w:t xml:space="preserve"> </w:t>
-      </w:r>
-      <w:r>
-        <w:t xml:space="preserve">has no byte enables and resets its array; the checks below use a model with byte</w:t>
-      </w:r>
-      <w:r>
-        <w:t xml:space="preserve"> </w:t>
-      </w:r>
-      <w:r>
-        <w:t xml:space="preserve">enables and no reset.</w:t>
-      </w:r>
-    </w:p>
-    <w:p>
-      <w:pPr>
-        <w:pStyle w:val="BodyText"/>
-      </w:pPr>
-      <w:r>
-        <w:t xml:space="preserve">Checks QSOC adds.</w:t>
-      </w:r>
-      <w:r>
-        <w:t xml:space="preserve"> </w:t>
-      </w:r>
-      <w:r>
-        <w:rPr>
-          <w:rStyle w:val="VerbatimChar"/>
-        </w:rPr>
-        <w:t xml:space="preserve">dv/isram</w:t>
-      </w:r>
-      <w:r>
-        <w:t xml:space="preserve"> </w:t>
-      </w:r>
-      <w:r>
-        <w:t xml:space="preserve">and</w:t>
-      </w:r>
-      <w:r>
-        <w:t xml:space="preserve"> </w:t>
-      </w:r>
-      <w:r>
-        <w:rPr>
-          <w:rStyle w:val="VerbatimChar"/>
-        </w:rPr>
-        <w:t xml:space="preserve">dv/dsram</w:t>
-      </w:r>
-      <w:r>
-        <w:t xml:space="preserve"> </w:t>
-      </w:r>
-      <w:r>
-        <w:t xml:space="preserve">run the same tests, in</w:t>
-      </w:r>
-      <w:r>
-        <w:t xml:space="preserve"> </w:t>
-      </w:r>
-      <w:r>
-        <w:rPr>
-          <w:rStyle w:val="VerbatimChar"/>
-        </w:rPr>
-        <w:t xml:space="preserve">dv/ram_common</w:t>
-      </w:r>
-      <w:r>
-        <w:t xml:space="preserve">,</w:t>
-      </w:r>
-      <w:r>
-        <w:t xml:space="preserve"> </w:t>
-      </w:r>
-      <w:r>
-        <w:t xml:space="preserve">against a macro model with byte enables and no reset;</w:t>
-      </w:r>
-      <w:r>
-        <w:t xml:space="preserve"> </w:t>
-      </w:r>
-      <w:r>
-        <w:rPr>
-          <w:rStyle w:val="VerbatimChar"/>
-        </w:rPr>
-        <w:t xml:space="preserve">make sim BLOCK=isram</w:t>
-      </w:r>
-      <w:r>
-        <w:t xml:space="preserve"> </w:t>
-      </w:r>
-      <w:r>
-        <w:t xml:space="preserve">and</w:t>
-      </w:r>
-      <w:r>
-        <w:t xml:space="preserve"> </w:t>
-      </w:r>
-      <w:r>
-        <w:rPr>
-          <w:rStyle w:val="VerbatimChar"/>
-        </w:rPr>
-        <w:t xml:space="preserve">make sim BLOCK=dsram</w:t>
-      </w:r>
-      <w:r>
-        <w:t xml:space="preserve">. Both blocks pass all of them.</w:t>
+        <w:t xml:space="preserve">Accepted limits:</w:t>
       </w:r>
     </w:p>
     <w:p>
@@ -8182,16 +8174,58 @@
         <w:jc w:val="left"/>
       </w:pPr>
       <w:r>
+        <w:t xml:space="preserve">A ninth pending</w:t>
+      </w:r>
+      <w:r>
+        <w:t xml:space="preserve"> </w:t>
+      </w:r>
+      <w:r>
         <w:rPr>
           <w:rStyle w:val="VerbatimChar"/>
         </w:rPr>
-        <w:t xml:space="preserve">RAM_001</w:t>
-      </w:r>
-      <w:r>
-        <w:t xml:space="preserve"> </w:t>
-      </w:r>
-      <w:r>
-        <w:t xml:space="preserve">Each of the 15 non-zero</w:t>
+        <w:t xml:space="preserve">B</w:t>
+      </w:r>
+      <w:r>
+        <w:t xml:space="preserve"> </w:t>
+      </w:r>
+      <w:r>
+        <w:t xml:space="preserve">response is dropped – 7.1.</w:t>
+      </w:r>
+    </w:p>
+    <w:p>
+      <w:pPr>
+        <w:pStyle w:val="FirstParagraph"/>
+      </w:pPr>
+      <w:r>
+        <w:rPr>
+          <w:b/>
+          <w:bCs/>
+        </w:rPr>
+        <w:t xml:space="preserve">Open:</w:t>
+      </w:r>
+      <w:r>
+        <w:t xml:space="preserve"> </w:t>
+      </w:r>
+      <w:r>
+        <w:t xml:space="preserve">timing and area of both instances after synthesis.</w:t>
+      </w:r>
+    </w:p>
+    <w:bookmarkEnd w:id="46"/>
+    <w:bookmarkStart w:id="47" w:name="verification"/>
+    <w:p>
+      <w:pPr>
+        <w:pStyle w:val="Heading1"/>
+      </w:pPr>
+      <w:r>
+        <w:t xml:space="preserve">12. Verification</w:t>
+      </w:r>
+    </w:p>
+    <w:p>
+      <w:pPr>
+        <w:pStyle w:val="FirstParagraph"/>
+      </w:pPr>
+      <w:r>
+        <w:t xml:space="preserve">The IP’s regression runs unchanged against the controller alone:</w:t>
       </w:r>
       <w:r>
         <w:t xml:space="preserve"> </w:t>
@@ -8200,13 +8234,13 @@
         <w:rPr>
           <w:rStyle w:val="VerbatimChar"/>
         </w:rPr>
-        <w:t xml:space="preserve">wstrb</w:t>
-      </w:r>
-      <w:r>
-        <w:t xml:space="preserve"> </w:t>
-      </w:r>
-      <w:r>
-        <w:t xml:space="preserve">patterns writes only its bytes;</w:t>
+        <w:t xml:space="preserve">nguyenquanicd/AXI4-SRAM-CONTROLLER</w:t>
+      </w:r>
+      <w:r>
+        <w:t xml:space="preserve"> </w:t>
+      </w:r>
+      <w:r>
+        <w:t xml:space="preserve">at</w:t>
       </w:r>
       <w:r>
         <w:t xml:space="preserve"> </w:t>
@@ -8215,13 +8249,147 @@
         <w:rPr>
           <w:rStyle w:val="VerbatimChar"/>
         </w:rPr>
-        <w:t xml:space="preserve">0000</w:t>
-      </w:r>
-      <w:r>
-        <w:t xml:space="preserve"> </w:t>
-      </w:r>
-      <w:r>
-        <w:t xml:space="preserve">none – 7.3.</w:t>
+        <w:t xml:space="preserve">503d7cd98352378c09dff3930f7fdb0590ea643d</w:t>
+      </w:r>
+      <w:r>
+        <w:t xml:space="preserve">,</w:t>
+      </w:r>
+      <w:r>
+        <w:t xml:space="preserve"> </w:t>
+      </w:r>
+      <w:r>
+        <w:t xml:space="preserve">46 directed tests in</w:t>
+      </w:r>
+      <w:r>
+        <w:t xml:space="preserve"> </w:t>
+      </w:r>
+      <w:r>
+        <w:rPr>
+          <w:rStyle w:val="VerbatimChar"/>
+        </w:rPr>
+        <w:t xml:space="preserve">sim/vcs/tests/</w:t>
+      </w:r>
+      <w:r>
+        <w:t xml:space="preserve"> </w:t>
+      </w:r>
+      <w:r>
+        <w:t xml:space="preserve">on the Synopsys AXI VIP, self-checking in</w:t>
+      </w:r>
+      <w:r>
+        <w:t xml:space="preserve"> </w:t>
+      </w:r>
+      <w:r>
+        <w:rPr>
+          <w:rStyle w:val="VerbatimChar"/>
+        </w:rPr>
+        <w:t xml:space="preserve">sim/vcs/env/axi_svt_basic_env.sv</w:t>
+      </w:r>
+      <w:r>
+        <w:t xml:space="preserve">. Its macro model</w:t>
+      </w:r>
+      <w:r>
+        <w:t xml:space="preserve"> </w:t>
+      </w:r>
+      <w:r>
+        <w:rPr>
+          <w:rStyle w:val="VerbatimChar"/>
+        </w:rPr>
+        <w:t xml:space="preserve">sim/vcs/env/m_vlsi_sram_sp.sv</w:t>
+      </w:r>
+      <w:r>
+        <w:t xml:space="preserve"> </w:t>
+      </w:r>
+      <w:r>
+        <w:t xml:space="preserve">has no byte enables and resets its array; the checks below use a model with byte</w:t>
+      </w:r>
+      <w:r>
+        <w:t xml:space="preserve"> </w:t>
+      </w:r>
+      <w:r>
+        <w:t xml:space="preserve">enables and no reset.</w:t>
+      </w:r>
+    </w:p>
+    <w:p>
+      <w:pPr>
+        <w:pStyle w:val="BodyText"/>
+      </w:pPr>
+      <w:r>
+        <w:t xml:space="preserve">Checks QSOC adds.</w:t>
+      </w:r>
+      <w:r>
+        <w:t xml:space="preserve"> </w:t>
+      </w:r>
+      <w:r>
+        <w:rPr>
+          <w:rStyle w:val="VerbatimChar"/>
+        </w:rPr>
+        <w:t xml:space="preserve">dv/isram</w:t>
+      </w:r>
+      <w:r>
+        <w:t xml:space="preserve"> </w:t>
+      </w:r>
+      <w:r>
+        <w:t xml:space="preserve">and</w:t>
+      </w:r>
+      <w:r>
+        <w:t xml:space="preserve"> </w:t>
+      </w:r>
+      <w:r>
+        <w:rPr>
+          <w:rStyle w:val="VerbatimChar"/>
+        </w:rPr>
+        <w:t xml:space="preserve">dv/dsram</w:t>
+      </w:r>
+      <w:r>
+        <w:t xml:space="preserve"> </w:t>
+      </w:r>
+      <w:r>
+        <w:t xml:space="preserve">run the same tests, in</w:t>
+      </w:r>
+      <w:r>
+        <w:t xml:space="preserve"> </w:t>
+      </w:r>
+      <w:r>
+        <w:rPr>
+          <w:rStyle w:val="VerbatimChar"/>
+        </w:rPr>
+        <w:t xml:space="preserve">dv/ram_common</w:t>
+      </w:r>
+      <w:r>
+        <w:t xml:space="preserve">,</w:t>
+      </w:r>
+      <w:r>
+        <w:t xml:space="preserve"> </w:t>
+      </w:r>
+      <w:r>
+        <w:t xml:space="preserve">against a macro model with byte enables and no reset;</w:t>
+      </w:r>
+      <w:r>
+        <w:t xml:space="preserve"> </w:t>
+      </w:r>
+      <w:r>
+        <w:rPr>
+          <w:rStyle w:val="VerbatimChar"/>
+        </w:rPr>
+        <w:t xml:space="preserve">make sim BLOCK=isram</w:t>
+      </w:r>
+      <w:r>
+        <w:t xml:space="preserve"> </w:t>
+      </w:r>
+      <w:r>
+        <w:t xml:space="preserve">and</w:t>
+      </w:r>
+      <w:r>
+        <w:t xml:space="preserve"> </w:t>
+      </w:r>
+      <w:r>
+        <w:rPr>
+          <w:rStyle w:val="VerbatimChar"/>
+        </w:rPr>
+        <w:t xml:space="preserve">make sim BLOCK=dsram</w:t>
+      </w:r>
+      <w:r>
+        <w:t xml:space="preserve">. Both blocks pass all of them.</w:t>
       </w:r>
     </w:p>
     <w:p>
@@ -8229,7 +8397,7 @@
         <w:pStyle w:val="Compact"/>
         <w:numPr>
           <w:ilvl w:val="0"/>
-          <w:numId w:val="1003"/>
+          <w:numId w:val="1004"/>
         </w:numPr>
         <w:jc w:val="left"/>
       </w:pPr>
@@ -8237,13 +8405,13 @@
         <w:rPr>
           <w:rStyle w:val="VerbatimChar"/>
         </w:rPr>
-        <w:t xml:space="preserve">RAM_002</w:t>
-      </w:r>
-      <w:r>
-        <w:t xml:space="preserve"> </w:t>
-      </w:r>
-      <w:r>
-        <w:t xml:space="preserve">Assertion:</w:t>
+        <w:t xml:space="preserve">RAM_001</w:t>
+      </w:r>
+      <w:r>
+        <w:t xml:space="preserve"> </w:t>
+      </w:r>
+      <w:r>
+        <w:t xml:space="preserve">Each of the 15 non-zero</w:t>
       </w:r>
       <w:r>
         <w:t xml:space="preserve"> </w:t>
@@ -8252,13 +8420,13 @@
         <w:rPr>
           <w:rStyle w:val="VerbatimChar"/>
         </w:rPr>
-        <w:t xml:space="preserve">STRBFIFO</w:t>
-      </w:r>
-      <w:r>
-        <w:t xml:space="preserve"> </w:t>
-      </w:r>
-      <w:r>
-        <w:t xml:space="preserve">and</w:t>
+        <w:t xml:space="preserve">wstrb</w:t>
+      </w:r>
+      <w:r>
+        <w:t xml:space="preserve"> </w:t>
+      </w:r>
+      <w:r>
+        <w:t xml:space="preserve">patterns writes only its bytes;</w:t>
       </w:r>
       <w:r>
         <w:t xml:space="preserve"> </w:t>
@@ -8267,19 +8435,13 @@
         <w:rPr>
           <w:rStyle w:val="VerbatimChar"/>
         </w:rPr>
-        <w:t xml:space="preserve">WFIFO</w:t>
-      </w:r>
-      <w:r>
-        <w:t xml:space="preserve"> </w:t>
-      </w:r>
-      <w:r>
-        <w:t xml:space="preserve">occupancy are equal in every cycle – 7.3.</w:t>
-      </w:r>
-      <w:r>
-        <w:t xml:space="preserve"> </w:t>
-      </w:r>
-      <w:r>
-        <w:t xml:space="preserve">The assertion runs in every cycle of every test; the test fills the FIFOs on purpose.</w:t>
+        <w:t xml:space="preserve">0000</w:t>
+      </w:r>
+      <w:r>
+        <w:t xml:space="preserve"> </w:t>
+      </w:r>
+      <w:r>
+        <w:t xml:space="preserve">none – 7.3.</w:t>
       </w:r>
     </w:p>
     <w:p>
@@ -8287,21 +8449,30 @@
         <w:pStyle w:val="Compact"/>
         <w:numPr>
           <w:ilvl w:val="0"/>
-          <w:numId w:val="1003"/>
+          <w:numId w:val="1004"/>
         </w:numPr>
         <w:jc w:val="left"/>
       </w:pPr>
       <w:r>
-        <w:t xml:space="preserve">A C program writing</w:t>
-      </w:r>
-      <w:r>
-        <w:t xml:space="preserve"> </w:t>
-      </w:r>
-      <w:r>
         <w:rPr>
           <w:rStyle w:val="VerbatimChar"/>
         </w:rPr>
-        <w:t xml:space="preserve">uint8_t</w:t>
+        <w:t xml:space="preserve">RAM_002</w:t>
+      </w:r>
+      <w:r>
+        <w:t xml:space="preserve"> </w:t>
+      </w:r>
+      <w:r>
+        <w:t xml:space="preserve">Assertion:</w:t>
+      </w:r>
+      <w:r>
+        <w:t xml:space="preserve"> </w:t>
+      </w:r>
+      <w:r>
+        <w:rPr>
+          <w:rStyle w:val="VerbatimChar"/>
+        </w:rPr>
+        <w:t xml:space="preserve">STRBFIFO</w:t>
       </w:r>
       <w:r>
         <w:t xml:space="preserve"> </w:t>
@@ -8316,62 +8487,19 @@
         <w:rPr>
           <w:rStyle w:val="VerbatimChar"/>
         </w:rPr>
-        <w:t xml:space="preserve">uint16_t</w:t>
-      </w:r>
-      <w:r>
-        <w:t xml:space="preserve"> </w:t>
-      </w:r>
-      <w:r>
-        <w:t xml:space="preserve">data leaves neighbours intact – 7.3.</w:t>
-      </w:r>
-      <w:r>
-        <w:t xml:space="preserve"> </w:t>
-      </w:r>
-      <w:r>
-        <w:rPr>
-          <w:b/>
-          <w:bCs/>
-        </w:rPr>
-        <w:t xml:space="preserve">Not simulated:</w:t>
-      </w:r>
-      <w:r>
-        <w:t xml:space="preserve"> </w:t>
-      </w:r>
-      <w:r>
-        <w:t xml:space="preserve">it needs the CPU and</w:t>
-      </w:r>
-      <w:r>
-        <w:t xml:space="preserve"> </w:t>
-      </w:r>
-      <w:r>
-        <w:rPr>
-          <w:rStyle w:val="VerbatimChar"/>
-        </w:rPr>
-        <w:t xml:space="preserve">CPU2AXI</w:t>
-      </w:r>
-      <w:r>
-        <w:t xml:space="preserve">.</w:t>
-      </w:r>
-      <w:r>
-        <w:t xml:space="preserve"> </w:t>
-      </w:r>
-      <w:r>
-        <w:rPr>
-          <w:rStyle w:val="VerbatimChar"/>
-        </w:rPr>
-        <w:t xml:space="preserve">RAM_001</w:t>
-      </w:r>
-      <w:r>
-        <w:t xml:space="preserve"> </w:t>
-      </w:r>
-      <w:r>
-        <w:t xml:space="preserve">covers the same bytes at</w:t>
-      </w:r>
-      <w:r>
-        <w:t xml:space="preserve"> </w:t>
-      </w:r>
-      <w:r>
-        <w:t xml:space="preserve">the port.</w:t>
+        <w:t xml:space="preserve">WFIFO</w:t>
+      </w:r>
+      <w:r>
+        <w:t xml:space="preserve"> </w:t>
+      </w:r>
+      <w:r>
+        <w:t xml:space="preserve">occupancy are equal in every cycle – 7.3.</w:t>
+      </w:r>
+      <w:r>
+        <w:t xml:space="preserve"> </w:t>
+      </w:r>
+      <w:r>
+        <w:t xml:space="preserve">The assertion runs in every cycle of every test; the test fills the FIFOs on purpose.</w:t>
       </w:r>
     </w:p>
     <w:p>
@@ -8379,21 +8507,91 @@
         <w:pStyle w:val="Compact"/>
         <w:numPr>
           <w:ilvl w:val="0"/>
-          <w:numId w:val="1003"/>
+          <w:numId w:val="1004"/>
         </w:numPr>
         <w:jc w:val="left"/>
       </w:pPr>
       <w:r>
+        <w:t xml:space="preserve">A C program writing</w:t>
+      </w:r>
+      <w:r>
+        <w:t xml:space="preserve"> </w:t>
+      </w:r>
+      <w:r>
         <w:rPr>
           <w:rStyle w:val="VerbatimChar"/>
         </w:rPr>
-        <w:t xml:space="preserve">RAM_004</w:t>
-      </w:r>
-      <w:r>
-        <w:t xml:space="preserve"> </w:t>
-      </w:r>
-      <w:r>
-        <w:t xml:space="preserve">Every value of the timing table of 7.1, measured at the block ports.</w:t>
+        <w:t xml:space="preserve">uint8_t</w:t>
+      </w:r>
+      <w:r>
+        <w:t xml:space="preserve"> </w:t>
+      </w:r>
+      <w:r>
+        <w:t xml:space="preserve">and</w:t>
+      </w:r>
+      <w:r>
+        <w:t xml:space="preserve"> </w:t>
+      </w:r>
+      <w:r>
+        <w:rPr>
+          <w:rStyle w:val="VerbatimChar"/>
+        </w:rPr>
+        <w:t xml:space="preserve">uint16_t</w:t>
+      </w:r>
+      <w:r>
+        <w:t xml:space="preserve"> </w:t>
+      </w:r>
+      <w:r>
+        <w:t xml:space="preserve">data leaves neighbours intact – 7.3.</w:t>
+      </w:r>
+      <w:r>
+        <w:t xml:space="preserve"> </w:t>
+      </w:r>
+      <w:r>
+        <w:rPr>
+          <w:b/>
+          <w:bCs/>
+        </w:rPr>
+        <w:t xml:space="preserve">Not simulated:</w:t>
+      </w:r>
+      <w:r>
+        <w:t xml:space="preserve"> </w:t>
+      </w:r>
+      <w:r>
+        <w:t xml:space="preserve">it needs the CPU and</w:t>
+      </w:r>
+      <w:r>
+        <w:t xml:space="preserve"> </w:t>
+      </w:r>
+      <w:r>
+        <w:rPr>
+          <w:rStyle w:val="VerbatimChar"/>
+        </w:rPr>
+        <w:t xml:space="preserve">CPU2AXI</w:t>
+      </w:r>
+      <w:r>
+        <w:t xml:space="preserve">.</w:t>
+      </w:r>
+      <w:r>
+        <w:t xml:space="preserve"> </w:t>
+      </w:r>
+      <w:r>
+        <w:rPr>
+          <w:rStyle w:val="VerbatimChar"/>
+        </w:rPr>
+        <w:t xml:space="preserve">RAM_001</w:t>
+      </w:r>
+      <w:r>
+        <w:t xml:space="preserve"> </w:t>
+      </w:r>
+      <w:r>
+        <w:t xml:space="preserve">covers the same bytes at</w:t>
+      </w:r>
+      <w:r>
+        <w:t xml:space="preserve"> </w:t>
+      </w:r>
+      <w:r>
+        <w:t xml:space="preserve">the port.</w:t>
       </w:r>
     </w:p>
     <w:p>
@@ -8401,7 +8599,7 @@
         <w:pStyle w:val="Compact"/>
         <w:numPr>
           <w:ilvl w:val="0"/>
-          <w:numId w:val="1003"/>
+          <w:numId w:val="1004"/>
         </w:numPr>
         <w:jc w:val="left"/>
       </w:pPr>
@@ -8409,37 +8607,13 @@
         <w:rPr>
           <w:rStyle w:val="VerbatimChar"/>
         </w:rPr>
-        <w:t xml:space="preserve">RAM_005</w:t>
-      </w:r>
-      <w:r>
-        <w:t xml:space="preserve"> </w:t>
-      </w:r>
-      <w:r>
-        <w:rPr>
-          <w:rStyle w:val="VerbatimChar"/>
-        </w:rPr>
-        <w:t xml:space="preserve">B</w:t>
-      </w:r>
-      <w:r>
-        <w:t xml:space="preserve"> </w:t>
-      </w:r>
-      <w:r>
-        <w:t xml:space="preserve">and</w:t>
-      </w:r>
-      <w:r>
-        <w:t xml:space="preserve"> </w:t>
-      </w:r>
-      <w:r>
-        <w:rPr>
-          <w:rStyle w:val="VerbatimChar"/>
-        </w:rPr>
-        <w:t xml:space="preserve">R</w:t>
-      </w:r>
-      <w:r>
-        <w:t xml:space="preserve"> </w:t>
-      </w:r>
-      <w:r>
-        <w:t xml:space="preserve">return in acceptance order, each with its request’s ID – 7.1.</w:t>
+        <w:t xml:space="preserve">RAM_004</w:t>
+      </w:r>
+      <w:r>
+        <w:t xml:space="preserve"> </w:t>
+      </w:r>
+      <w:r>
+        <w:t xml:space="preserve">Every value of the timing table of 7.1, measured at the block ports.</w:t>
       </w:r>
     </w:p>
     <w:p>
@@ -8447,7 +8621,7 @@
         <w:pStyle w:val="Compact"/>
         <w:numPr>
           <w:ilvl w:val="0"/>
-          <w:numId w:val="1003"/>
+          <w:numId w:val="1004"/>
         </w:numPr>
         <w:jc w:val="left"/>
       </w:pPr>
@@ -8455,13 +8629,37 @@
         <w:rPr>
           <w:rStyle w:val="VerbatimChar"/>
         </w:rPr>
-        <w:t xml:space="preserve">RAM_006</w:t>
-      </w:r>
-      <w:r>
-        <w:t xml:space="preserve"> </w:t>
-      </w:r>
-      <w:r>
-        <w:t xml:space="preserve">Against an independent address model, aligned WRAP gives INCR addresses – 7.4.</w:t>
+        <w:t xml:space="preserve">RAM_005</w:t>
+      </w:r>
+      <w:r>
+        <w:t xml:space="preserve"> </w:t>
+      </w:r>
+      <w:r>
+        <w:rPr>
+          <w:rStyle w:val="VerbatimChar"/>
+        </w:rPr>
+        <w:t xml:space="preserve">B</w:t>
+      </w:r>
+      <w:r>
+        <w:t xml:space="preserve"> </w:t>
+      </w:r>
+      <w:r>
+        <w:t xml:space="preserve">and</w:t>
+      </w:r>
+      <w:r>
+        <w:t xml:space="preserve"> </w:t>
+      </w:r>
+      <w:r>
+        <w:rPr>
+          <w:rStyle w:val="VerbatimChar"/>
+        </w:rPr>
+        <w:t xml:space="preserve">R</w:t>
+      </w:r>
+      <w:r>
+        <w:t xml:space="preserve"> </w:t>
+      </w:r>
+      <w:r>
+        <w:t xml:space="preserve">return in acceptance order, each with its request’s ID – 7.1.</w:t>
       </w:r>
     </w:p>
     <w:p>
@@ -8469,7 +8667,7 @@
         <w:pStyle w:val="Compact"/>
         <w:numPr>
           <w:ilvl w:val="0"/>
-          <w:numId w:val="1003"/>
+          <w:numId w:val="1004"/>
         </w:numPr>
         <w:jc w:val="left"/>
       </w:pPr>
@@ -8477,49 +8675,13 @@
         <w:rPr>
           <w:rStyle w:val="VerbatimChar"/>
         </w:rPr>
-        <w:t xml:space="preserve">RAM_007</w:t>
-      </w:r>
-      <w:r>
-        <w:t xml:space="preserve"> </w:t>
-      </w:r>
-      <w:r>
-        <w:rPr>
-          <w:rStyle w:val="VerbatimChar"/>
-        </w:rPr>
-        <w:t xml:space="preserve">o_mem_addr</w:t>
-      </w:r>
-      <w:r>
-        <w:t xml:space="preserve"> </w:t>
-      </w:r>
-      <w:r>
-        <w:t xml:space="preserve">is</w:t>
-      </w:r>
-      <w:r>
-        <w:t xml:space="preserve"> </w:t>
-      </w:r>
-      <w:r>
-        <w:rPr>
-          <w:rStyle w:val="VerbatimChar"/>
-        </w:rPr>
-        <w:t xml:space="preserve">[15:2]</w:t>
-      </w:r>
-      <w:r>
-        <w:t xml:space="preserve"> </w:t>
-      </w:r>
-      <w:r>
-        <w:t xml:space="preserve">/</w:t>
-      </w:r>
-      <w:r>
-        <w:t xml:space="preserve"> </w:t>
-      </w:r>
-      <w:r>
-        <w:rPr>
-          <w:rStyle w:val="VerbatimChar"/>
-        </w:rPr>
-        <w:t xml:space="preserve">[14:2]</w:t>
-      </w:r>
-      <w:r>
-        <w:t xml:space="preserve">; an unaligned single beat hits its word – 7.2.</w:t>
+        <w:t xml:space="preserve">RAM_006</w:t>
+      </w:r>
+      <w:r>
+        <w:t xml:space="preserve"> </w:t>
+      </w:r>
+      <w:r>
+        <w:t xml:space="preserve">Against an independent address model, aligned WRAP gives INCR addresses – 7.4.</w:t>
       </w:r>
     </w:p>
     <w:p>
@@ -8527,7 +8689,7 @@
         <w:pStyle w:val="Compact"/>
         <w:numPr>
           <w:ilvl w:val="0"/>
-          <w:numId w:val="1003"/>
+          <w:numId w:val="1004"/>
         </w:numPr>
         <w:jc w:val="left"/>
       </w:pPr>
@@ -8535,7 +8697,7 @@
         <w:rPr>
           <w:rStyle w:val="VerbatimChar"/>
         </w:rPr>
-        <w:t xml:space="preserve">RAM_008</w:t>
+        <w:t xml:space="preserve">RAM_007</w:t>
       </w:r>
       <w:r>
         <w:t xml:space="preserve"> </w:t>
@@ -8544,13 +8706,13 @@
         <w:rPr>
           <w:rStyle w:val="VerbatimChar"/>
         </w:rPr>
-        <w:t xml:space="preserve">BRESP</w:t>
-      </w:r>
-      <w:r>
-        <w:t xml:space="preserve"> </w:t>
-      </w:r>
-      <w:r>
-        <w:t xml:space="preserve">and</w:t>
+        <w:t xml:space="preserve">o_mem_addr</w:t>
+      </w:r>
+      <w:r>
+        <w:t xml:space="preserve"> </w:t>
+      </w:r>
+      <w:r>
+        <w:t xml:space="preserve">is</w:t>
       </w:r>
       <w:r>
         <w:t xml:space="preserve"> </w:t>
@@ -8559,13 +8721,13 @@
         <w:rPr>
           <w:rStyle w:val="VerbatimChar"/>
         </w:rPr>
-        <w:t xml:space="preserve">RRESP</w:t>
-      </w:r>
-      <w:r>
-        <w:t xml:space="preserve"> </w:t>
-      </w:r>
-      <w:r>
-        <w:t xml:space="preserve">are</w:t>
+        <w:t xml:space="preserve">[15:2]</w:t>
+      </w:r>
+      <w:r>
+        <w:t xml:space="preserve"> </w:t>
+      </w:r>
+      <w:r>
+        <w:t xml:space="preserve">/</w:t>
       </w:r>
       <w:r>
         <w:t xml:space="preserve"> </w:t>
@@ -8574,13 +8736,10 @@
         <w:rPr>
           <w:rStyle w:val="VerbatimChar"/>
         </w:rPr>
-        <w:t xml:space="preserve">00</w:t>
-      </w:r>
-      <w:r>
-        <w:t xml:space="preserve"> </w:t>
-      </w:r>
-      <w:r>
-        <w:t xml:space="preserve">for every access – 7.5.</w:t>
+        <w:t xml:space="preserve">[14:2]</w:t>
+      </w:r>
+      <w:r>
+        <w:t xml:space="preserve">; an unaligned single beat hits its word – 7.2.</w:t>
       </w:r>
     </w:p>
     <w:p>
@@ -8588,7 +8747,7 @@
         <w:pStyle w:val="Compact"/>
         <w:numPr>
           <w:ilvl w:val="0"/>
-          <w:numId w:val="1003"/>
+          <w:numId w:val="1004"/>
         </w:numPr>
         <w:jc w:val="left"/>
       </w:pPr>
@@ -8596,13 +8755,7 @@
         <w:rPr>
           <w:rStyle w:val="VerbatimChar"/>
         </w:rPr>
-        <w:t xml:space="preserve">RAM_009</w:t>
-      </w:r>
-      <w:r>
-        <w:t xml:space="preserve"> </w:t>
-      </w:r>
-      <w:r>
-        <w:t xml:space="preserve">Reset values of 7.6; a pattern survives an</w:t>
+        <w:t xml:space="preserve">RAM_008</w:t>
       </w:r>
       <w:r>
         <w:t xml:space="preserve"> </w:t>
@@ -8611,13 +8764,43 @@
         <w:rPr>
           <w:rStyle w:val="VerbatimChar"/>
         </w:rPr>
-        <w:t xml:space="preserve">i_rst_n_mem</w:t>
-      </w:r>
-      <w:r>
-        <w:t xml:space="preserve"> </w:t>
-      </w:r>
-      <w:r>
-        <w:t xml:space="preserve">pulse – 7.6.</w:t>
+        <w:t xml:space="preserve">BRESP</w:t>
+      </w:r>
+      <w:r>
+        <w:t xml:space="preserve"> </w:t>
+      </w:r>
+      <w:r>
+        <w:t xml:space="preserve">and</w:t>
+      </w:r>
+      <w:r>
+        <w:t xml:space="preserve"> </w:t>
+      </w:r>
+      <w:r>
+        <w:rPr>
+          <w:rStyle w:val="VerbatimChar"/>
+        </w:rPr>
+        <w:t xml:space="preserve">RRESP</w:t>
+      </w:r>
+      <w:r>
+        <w:t xml:space="preserve"> </w:t>
+      </w:r>
+      <w:r>
+        <w:t xml:space="preserve">are</w:t>
+      </w:r>
+      <w:r>
+        <w:t xml:space="preserve"> </w:t>
+      </w:r>
+      <w:r>
+        <w:rPr>
+          <w:rStyle w:val="VerbatimChar"/>
+        </w:rPr>
+        <w:t xml:space="preserve">00</w:t>
+      </w:r>
+      <w:r>
+        <w:t xml:space="preserve"> </w:t>
+      </w:r>
+      <w:r>
+        <w:t xml:space="preserve">for every access – 7.5.</w:t>
       </w:r>
     </w:p>
     <w:p>
@@ -8625,34 +8808,36 @@
         <w:pStyle w:val="Compact"/>
         <w:numPr>
           <w:ilvl w:val="0"/>
-          <w:numId w:val="1003"/>
+          <w:numId w:val="1004"/>
         </w:numPr>
         <w:jc w:val="left"/>
       </w:pPr>
       <w:r>
-        <w:t xml:space="preserve">Macro pin tie-offs match the databook – section 10.</w:t>
-      </w:r>
-      <w:r>
-        <w:t xml:space="preserve"> </w:t>
-      </w:r>
-      <w:r>
-        <w:rPr>
-          <w:b/>
-          <w:bCs/>
-        </w:rPr>
-        <w:t xml:space="preserve">Not simulated:</w:t>
-      </w:r>
-      <w:r>
-        <w:t xml:space="preserve"> </w:t>
-      </w:r>
-      <w:r>
-        <w:t xml:space="preserve">the</w:t>
-      </w:r>
-      <w:r>
-        <w:t xml:space="preserve"> </w:t>
-      </w:r>
-      <w:r>
-        <w:t xml:space="preserve">testbench has a behavioural model, not the macro. It belongs to physical design.</w:t>
+        <w:rPr>
+          <w:rStyle w:val="VerbatimChar"/>
+        </w:rPr>
+        <w:t xml:space="preserve">RAM_009</w:t>
+      </w:r>
+      <w:r>
+        <w:t xml:space="preserve"> </w:t>
+      </w:r>
+      <w:r>
+        <w:t xml:space="preserve">Reset values of 7.6; a pattern survives an</w:t>
+      </w:r>
+      <w:r>
+        <w:t xml:space="preserve"> </w:t>
+      </w:r>
+      <w:r>
+        <w:rPr>
+          <w:rStyle w:val="VerbatimChar"/>
+        </w:rPr>
+        <w:t xml:space="preserve">i_rst_n_mem</w:t>
+      </w:r>
+      <w:r>
+        <w:t xml:space="preserve"> </w:t>
+      </w:r>
+      <w:r>
+        <w:t xml:space="preserve">pulse – 7.6.</w:t>
       </w:r>
     </w:p>
     <w:p>
@@ -8660,57 +8845,34 @@
         <w:pStyle w:val="Compact"/>
         <w:numPr>
           <w:ilvl w:val="0"/>
-          <w:numId w:val="1003"/>
+          <w:numId w:val="1004"/>
         </w:numPr>
         <w:jc w:val="left"/>
       </w:pPr>
       <w:r>
-        <w:t xml:space="preserve">The vendored</w:t>
-      </w:r>
-      <w:r>
-        <w:t xml:space="preserve"> </w:t>
-      </w:r>
-      <w:r>
-        <w:rPr>
-          <w:rStyle w:val="VerbatimChar"/>
-        </w:rPr>
-        <w:t xml:space="preserve">rtl/</w:t>
-      </w:r>
-      <w:r>
-        <w:t xml:space="preserve"> </w:t>
-      </w:r>
-      <w:r>
-        <w:t xml:space="preserve">files match commit</w:t>
-      </w:r>
-      <w:r>
-        <w:t xml:space="preserve"> </w:t>
-      </w:r>
-      <w:r>
-        <w:rPr>
-          <w:rStyle w:val="VerbatimChar"/>
-        </w:rPr>
-        <w:t xml:space="preserve">503d7cd</w:t>
-      </w:r>
-      <w:r>
-        <w:t xml:space="preserve"> </w:t>
-      </w:r>
-      <w:r>
-        <w:t xml:space="preserve">– section 4. Checked by CI</w:t>
-      </w:r>
-      <w:r>
-        <w:t xml:space="preserve"> </w:t>
-      </w:r>
-      <w:r>
-        <w:t xml:space="preserve">(</w:t>
-      </w:r>
-      <w:r>
-        <w:rPr>
-          <w:rStyle w:val="VerbatimChar"/>
-        </w:rPr>
-        <w:t xml:space="preserve">Vendor tree unmodified</w:t>
-      </w:r>
-      <w:r>
-        <w:t xml:space="preserve">), not by simulation.</w:t>
+        <w:t xml:space="preserve">Macro pin tie-offs match the databook – section 10.</w:t>
+      </w:r>
+      <w:r>
+        <w:t xml:space="preserve"> </w:t>
+      </w:r>
+      <w:r>
+        <w:rPr>
+          <w:b/>
+          <w:bCs/>
+        </w:rPr>
+        <w:t xml:space="preserve">Not simulated:</w:t>
+      </w:r>
+      <w:r>
+        <w:t xml:space="preserve"> </w:t>
+      </w:r>
+      <w:r>
+        <w:t xml:space="preserve">the</w:t>
+      </w:r>
+      <w:r>
+        <w:t xml:space="preserve"> </w:t>
+      </w:r>
+      <w:r>
+        <w:t xml:space="preserve">testbench has a behavioural model, not the macro. It belongs to physical design.</w:t>
       </w:r>
     </w:p>
     <w:p>
@@ -8718,14 +8880,72 @@
         <w:pStyle w:val="Compact"/>
         <w:numPr>
           <w:ilvl w:val="0"/>
-          <w:numId w:val="1003"/>
+          <w:numId w:val="1004"/>
         </w:numPr>
         <w:jc w:val="left"/>
       </w:pPr>
       <w:r>
+        <w:t xml:space="preserve">The vendored</w:t>
+      </w:r>
+      <w:r>
+        <w:t xml:space="preserve"> </w:t>
+      </w:r>
+      <w:r>
         <w:rPr>
           <w:rStyle w:val="VerbatimChar"/>
         </w:rPr>
+        <w:t xml:space="preserve">rtl/</w:t>
+      </w:r>
+      <w:r>
+        <w:t xml:space="preserve"> </w:t>
+      </w:r>
+      <w:r>
+        <w:t xml:space="preserve">files match commit</w:t>
+      </w:r>
+      <w:r>
+        <w:t xml:space="preserve"> </w:t>
+      </w:r>
+      <w:r>
+        <w:rPr>
+          <w:rStyle w:val="VerbatimChar"/>
+        </w:rPr>
+        <w:t xml:space="preserve">503d7cd</w:t>
+      </w:r>
+      <w:r>
+        <w:t xml:space="preserve"> </w:t>
+      </w:r>
+      <w:r>
+        <w:t xml:space="preserve">– section 4. Checked by CI</w:t>
+      </w:r>
+      <w:r>
+        <w:t xml:space="preserve"> </w:t>
+      </w:r>
+      <w:r>
+        <w:t xml:space="preserve">(</w:t>
+      </w:r>
+      <w:r>
+        <w:rPr>
+          <w:rStyle w:val="VerbatimChar"/>
+        </w:rPr>
+        <w:t xml:space="preserve">Vendor tree unmodified</w:t>
+      </w:r>
+      <w:r>
+        <w:t xml:space="preserve">), not by simulation.</w:t>
+      </w:r>
+    </w:p>
+    <w:p>
+      <w:pPr>
+        <w:pStyle w:val="Compact"/>
+        <w:numPr>
+          <w:ilvl w:val="0"/>
+          <w:numId w:val="1004"/>
+        </w:numPr>
+        <w:jc w:val="left"/>
+      </w:pPr>
+      <w:r>
+        <w:rPr>
+          <w:rStyle w:val="VerbatimChar"/>
+        </w:rPr>
         <w:t xml:space="preserve">RAM_012</w:t>
       </w:r>
       <w:r>
@@ -8769,6 +8989,55 @@
       </w:r>
       <w:r>
         <w:t xml:space="preserve">stalled at random – 7.2.</w:t>
+      </w:r>
+    </w:p>
+    <w:p>
+      <w:pPr>
+        <w:pStyle w:val="Compact"/>
+        <w:numPr>
+          <w:ilvl w:val="0"/>
+          <w:numId w:val="1004"/>
+        </w:numPr>
+        <w:jc w:val="left"/>
+      </w:pPr>
+      <w:r>
+        <w:rPr>
+          <w:rStyle w:val="VerbatimChar"/>
+        </w:rPr>
+        <w:t xml:space="preserve">RAM_013</w:t>
+      </w:r>
+      <w:r>
+        <w:t xml:space="preserve"> </w:t>
+      </w:r>
+      <w:r>
+        <w:t xml:space="preserve">(added) 8 write responses held back by</w:t>
+      </w:r>
+      <w:r>
+        <w:t xml:space="preserve"> </w:t>
+      </w:r>
+      <w:r>
+        <w:rPr>
+          <w:rStyle w:val="VerbatimChar"/>
+        </w:rPr>
+        <w:t xml:space="preserve">BREADY</w:t>
+      </w:r>
+      <w:r>
+        <w:t xml:space="preserve"> </w:t>
+      </w:r>
+      <w:r>
+        <w:t xml:space="preserve">are all delivered; of 10 writes,</w:t>
+      </w:r>
+      <w:r>
+        <w:t xml:space="preserve"> </w:t>
+      </w:r>
+      <w:r>
+        <w:t xml:space="preserve">8 responses return and 2 are dropped – 7.1. The test states the accepted limit, so a</w:t>
+      </w:r>
+      <w:r>
+        <w:t xml:space="preserve"> </w:t>
+      </w:r>
+      <w:r>
+        <w:t xml:space="preserve">change in it is a decision.</w:t>
       </w:r>
     </w:p>
     <w:bookmarkEnd w:id="47"/>
@@ -11484,6 +11753,36 @@
     <w:abstractNumId w:val="991"/>
   </w:num>
   <w:num w:numId="1003">
+    <w:abstractNumId w:val="99411"/>
+    <w:lvlOverride w:ilvl="0">
+      <w:startOverride w:val="1"/>
+    </w:lvlOverride>
+    <w:lvlOverride w:ilvl="1">
+      <w:startOverride w:val="1"/>
+    </w:lvlOverride>
+    <w:lvlOverride w:ilvl="2">
+      <w:startOverride w:val="1"/>
+    </w:lvlOverride>
+    <w:lvlOverride w:ilvl="3">
+      <w:startOverride w:val="1"/>
+    </w:lvlOverride>
+    <w:lvlOverride w:ilvl="4">
+      <w:startOverride w:val="1"/>
+    </w:lvlOverride>
+    <w:lvlOverride w:ilvl="5">
+      <w:startOverride w:val="1"/>
+    </w:lvlOverride>
+    <w:lvlOverride w:ilvl="6">
+      <w:startOverride w:val="1"/>
+    </w:lvlOverride>
+    <w:lvlOverride w:ilvl="7">
+      <w:startOverride w:val="1"/>
+    </w:lvlOverride>
+    <w:lvlOverride w:ilvl="8">
+      <w:startOverride w:val="1"/>
+    </w:lvlOverride>
+  </w:num>
+  <w:num w:numId="1004">
     <w:abstractNumId w:val="99411"/>
     <w:lvlOverride w:ilvl="0">
       <w:startOverride w:val="1"/>

</xml_diff>